<commit_message>
feat(kinematics/vectors): migrate teacher guide to 5E phenomenon-based template
Vectors is the canonical example for the rest of the unit. The expansion
adds, per phase: minute-by-minute timing, teacher actions, sample teacher
language, anticipated student responses, and explicit teacher-facilitation
notes ('what to look for / resist / redirect').

The Restorative Circle (Phase 1) and Active Learning Vector Golf
(Phase 2) strategies are now described in-line where they actually
land in the lesson flow, not as a separate appendix. The Strategy
Spotlight section continues to exist as a quick-reference summary
that points back to those phase descriptions.
</commit_message>
<xml_diff>
--- a/Publisher_Ready_Curriculum/01_Physics_East_Meadow_Refactor/01_Kinematics/01_Vectors/Teacher_Guide.docx
+++ b/Publisher_Ready_Curriculum/01_Physics_East_Meadow_Refactor/01_Kinematics/01_Vectors/Teacher_Guide.docx
@@ -2,7 +2,7 @@
 <file path=word/document.xml><?xml version="1.0" encoding="utf-8"?>
 <w:document xmlns:w="http://schemas.openxmlformats.org/wordprocessingml/2006/main" xmlns:m="http://schemas.openxmlformats.org/officeDocument/2006/math" xmlns:r="http://schemas.openxmlformats.org/officeDocument/2006/relationships" xmlns:o="urn:schemas-microsoft-com:office:office" xmlns:v="urn:schemas-microsoft-com:vml" xmlns:w10="urn:schemas-microsoft-com:office:word" xmlns:a="http://schemas.openxmlformats.org/drawingml/2006/main" xmlns:pic="http://schemas.openxmlformats.org/drawingml/2006/picture" xmlns:wp="http://schemas.openxmlformats.org/drawingml/2006/wordprocessingDrawing">
   <w:body>
-    <w:bookmarkStart w:id="33" w:name="vectors-teacher-guide"/>
+    <w:bookmarkStart w:id="45" w:name="vectors-teacher-guide"/>
     <w:p>
       <w:pPr>
         <w:pStyle w:val="Heading1"/>
@@ -41,7 +41,14 @@
         <w:t xml:space="preserve"> </w:t>
       </w:r>
       <w:r>
-        <w:t xml:space="preserve">Strategy chips: RESTORATIVE CIRCLE, ACTIVE LEARNING</w:t>
+        <w:t xml:space="preserve">Strategy chips: RESTORATIVE CIRCLE · ACTIVE LEARNING</w:t>
+      </w:r>
+    </w:p>
+    <w:p>
+      <w:r>
+        <w:pict>
+          <v:rect style="width:0;height:1.5pt" o:hralign="center" o:hrstd="t" o:hr="t"/>
+        </w:pict>
       </w:r>
     </w:p>
     <w:bookmarkEnd w:id="9"/>
@@ -274,33 +281,1585 @@
         </w:r>
       </w:hyperlink>
     </w:p>
+    <w:p>
+      <w:r>
+        <w:pict>
+          <v:rect style="width:0;height:1.5pt" o:hralign="center" o:hrstd="t" o:hr="t"/>
+        </w:pict>
+      </w:r>
+    </w:p>
     <w:bookmarkEnd w:id="18"/>
     <w:bookmarkEnd w:id="19"/>
-    <w:bookmarkStart w:id="20" w:name="ccc-focus"/>
+    <w:bookmarkStart w:id="20" w:name="lesson-overview"/>
     <w:p>
       <w:pPr>
         <w:pStyle w:val="Heading2"/>
       </w:pPr>
       <w:r>
-        <w:t xml:space="preserve">CCC Focus</w:t>
+        <w:t xml:space="preserve">Lesson Overview</w:t>
       </w:r>
     </w:p>
+    <w:tbl>
+      <w:tblPr>
+        <w:tblStyle w:val="Table"/>
+        <w:tblW w:type="pct" w:w="5000"/>
+        <w:tblLayout w:type="fixed"/>
+        <w:tblLook w:firstRow="0" w:lastRow="0" w:firstColumn="0" w:lastColumn="0" w:noHBand="0" w:noVBand="0" w:val="0000"/>
+      </w:tblPr>
+      <w:tblGrid>
+        <w:gridCol w:w="3960"/>
+        <w:gridCol w:w="3960"/>
+      </w:tblGrid>
+      <w:tr>
+        <w:tc>
+          <w:tcPr/>
+          <w:p>
+            <w:pPr>
+              <w:pStyle w:val="Compact"/>
+            </w:pPr>
+            <w:r>
+              <w:rPr>
+                <w:b/>
+                <w:bCs/>
+              </w:rPr>
+              <w:t xml:space="preserve">Duration</w:t>
+            </w:r>
+          </w:p>
+        </w:tc>
+        <w:tc>
+          <w:tcPr/>
+          <w:p>
+            <w:pPr>
+              <w:pStyle w:val="Compact"/>
+            </w:pPr>
+            <w:r>
+              <w:t xml:space="preserve">42 minutes (1 period)</w:t>
+            </w:r>
+          </w:p>
+        </w:tc>
+      </w:tr>
+      <w:tr>
+        <w:tc>
+          <w:tcPr/>
+          <w:p>
+            <w:pPr>
+              <w:pStyle w:val="Compact"/>
+            </w:pPr>
+            <w:r>
+              <w:rPr>
+                <w:b/>
+                <w:bCs/>
+              </w:rPr>
+              <w:t xml:space="preserve">NYSSLS link</w:t>
+            </w:r>
+          </w:p>
+        </w:tc>
+        <w:tc>
+          <w:tcPr/>
+          <w:p>
+            <w:pPr>
+              <w:pStyle w:val="Compact"/>
+            </w:pPr>
+            <w:r>
+              <w:t xml:space="preserve">HS-PS2-1</w:t>
+            </w:r>
+          </w:p>
+        </w:tc>
+      </w:tr>
+      <w:tr>
+        <w:tc>
+          <w:tcPr/>
+          <w:p>
+            <w:pPr>
+              <w:pStyle w:val="Compact"/>
+            </w:pPr>
+            <w:r>
+              <w:rPr>
+                <w:b/>
+                <w:bCs/>
+              </w:rPr>
+              <w:t xml:space="preserve">CCC focus</w:t>
+            </w:r>
+          </w:p>
+        </w:tc>
+        <w:tc>
+          <w:tcPr/>
+          <w:p>
+            <w:pPr>
+              <w:pStyle w:val="Compact"/>
+            </w:pPr>
+            <w:r>
+              <w:t xml:space="preserve">Cause and Effect — how the</w:t>
+            </w:r>
+            <w:r>
+              <w:t xml:space="preserve"> </w:t>
+            </w:r>
+            <w:r>
+              <w:rPr>
+                <w:i/>
+                <w:iCs/>
+              </w:rPr>
+              <w:t xml:space="preserve">direction</w:t>
+            </w:r>
+            <w:r>
+              <w:t xml:space="preserve"> </w:t>
+            </w:r>
+            <w:r>
+              <w:t xml:space="preserve">of a force changes motion, not just its magnitude.</w:t>
+            </w:r>
+          </w:p>
+        </w:tc>
+      </w:tr>
+      <w:tr>
+        <w:tc>
+          <w:tcPr/>
+          <w:p>
+            <w:pPr>
+              <w:pStyle w:val="Compact"/>
+            </w:pPr>
+            <w:r>
+              <w:rPr>
+                <w:b/>
+                <w:bCs/>
+              </w:rPr>
+              <w:t xml:space="preserve">Strategy chips</w:t>
+            </w:r>
+          </w:p>
+        </w:tc>
+        <w:tc>
+          <w:tcPr/>
+          <w:p>
+            <w:pPr>
+              <w:pStyle w:val="Compact"/>
+            </w:pPr>
+            <w:r>
+              <w:t xml:space="preserve">RESTORATIVE CIRCLE (unit opener) · ACTIVE LEARNING (Vector Golf stations)</w:t>
+            </w:r>
+          </w:p>
+        </w:tc>
+      </w:tr>
+      <w:tr>
+        <w:tc>
+          <w:tcPr/>
+          <w:p>
+            <w:pPr>
+              <w:pStyle w:val="Compact"/>
+            </w:pPr>
+            <w:r>
+              <w:rPr>
+                <w:b/>
+                <w:bCs/>
+              </w:rPr>
+              <w:t xml:space="preserve">Materials</w:t>
+            </w:r>
+          </w:p>
+        </w:tc>
+        <w:tc>
+          <w:tcPr/>
+          <w:p>
+            <w:pPr>
+              <w:pStyle w:val="Compact"/>
+            </w:pPr>
+            <w:r>
+              <w:t xml:space="preserve">Graph paper or vector grids (1 per student); rulers (1 per pair); printed Vector Golf course (4 stations × 1 copy each); chart paper for VNPS-style station work; colored markers (purple + blue per group, mirroring the brand palette); the slider-based interactive on each device or projected.</w:t>
+            </w:r>
+          </w:p>
+        </w:tc>
+      </w:tr>
+      <w:tr>
+        <w:tc>
+          <w:tcPr/>
+          <w:p>
+            <w:pPr>
+              <w:pStyle w:val="Compact"/>
+            </w:pPr>
+            <w:r>
+              <w:rPr>
+                <w:b/>
+                <w:bCs/>
+              </w:rPr>
+              <w:t xml:space="preserve">Safety</w:t>
+            </w:r>
+          </w:p>
+        </w:tc>
+        <w:tc>
+          <w:tcPr/>
+          <w:p>
+            <w:pPr>
+              <w:pStyle w:val="Compact"/>
+            </w:pPr>
+            <w:r>
+              <w:t xml:space="preserve">None.</w:t>
+            </w:r>
+          </w:p>
+        </w:tc>
+      </w:tr>
+      <w:tr>
+        <w:tc>
+          <w:tcPr/>
+          <w:p>
+            <w:pPr>
+              <w:pStyle w:val="Compact"/>
+            </w:pPr>
+            <w:r>
+              <w:rPr>
+                <w:b/>
+                <w:bCs/>
+              </w:rPr>
+              <w:t xml:space="preserve">Prior knowledge</w:t>
+            </w:r>
+          </w:p>
+        </w:tc>
+        <w:tc>
+          <w:tcPr/>
+          <w:p>
+            <w:pPr>
+              <w:pStyle w:val="Compact"/>
+            </w:pPr>
+            <w:r>
+              <w:t xml:space="preserve">Adding signed numbers; reading a coordinate grid; the difference between a measurement (number) and a measurement with direction (e.g.,</w:t>
+            </w:r>
+            <w:r>
+              <w:t xml:space="preserve"> </w:t>
+            </w:r>
+            <w:r>
+              <w:t xml:space="preserve">“30 mph”</w:t>
+            </w:r>
+            <w:r>
+              <w:t xml:space="preserve"> </w:t>
+            </w:r>
+            <w:r>
+              <w:t xml:space="preserve">vs</w:t>
+            </w:r>
+            <w:r>
+              <w:t xml:space="preserve"> </w:t>
+            </w:r>
+            <w:r>
+              <w:t xml:space="preserve">“30 mph north”</w:t>
+            </w:r>
+            <w:r>
+              <w:t xml:space="preserve">).</w:t>
+            </w:r>
+          </w:p>
+        </w:tc>
+      </w:tr>
+    </w:tbl>
     <w:p>
       <w:pPr>
-        <w:pStyle w:val="FirstParagraph"/>
+        <w:pStyle w:val="BodyText"/>
       </w:pPr>
       <w:r>
         <w:rPr>
           <w:b/>
           <w:bCs/>
         </w:rPr>
-        <w:t xml:space="preserve">Cause and Effect</w:t>
+        <w:t xml:space="preserve">Lesson objectives — students can:</w:t>
+      </w:r>
+    </w:p>
+    <w:p>
+      <w:pPr>
+        <w:pStyle w:val="Compact"/>
+        <w:numPr>
+          <w:ilvl w:val="0"/>
+          <w:numId w:val="1003"/>
+        </w:numPr>
+      </w:pPr>
+      <w:r>
+        <w:t xml:space="preserve">Describe a vector quantity using both</w:t>
       </w:r>
       <w:r>
         <w:t xml:space="preserve"> </w:t>
       </w:r>
       <w:r>
-        <w:t xml:space="preserve">— how the</w:t>
+        <w:rPr>
+          <w:b/>
+          <w:bCs/>
+        </w:rPr>
+        <w:t xml:space="preserve">magnitude</w:t>
+      </w:r>
+      <w:r>
+        <w:t xml:space="preserve"> </w:t>
+      </w:r>
+      <w:r>
+        <w:t xml:space="preserve">and</w:t>
+      </w:r>
+      <w:r>
+        <w:t xml:space="preserve"> </w:t>
+      </w:r>
+      <w:r>
+        <w:rPr>
+          <w:b/>
+          <w:bCs/>
+        </w:rPr>
+        <w:t xml:space="preserve">direction</w:t>
+      </w:r>
+      <w:r>
+        <w:t xml:space="preserve">.</w:t>
+      </w:r>
+    </w:p>
+    <w:p>
+      <w:pPr>
+        <w:pStyle w:val="Compact"/>
+        <w:numPr>
+          <w:ilvl w:val="0"/>
+          <w:numId w:val="1003"/>
+        </w:numPr>
+      </w:pPr>
+      <w:r>
+        <w:t xml:space="preserve">Add two vectors graphically using the head-to-tail method.</w:t>
+      </w:r>
+    </w:p>
+    <w:p>
+      <w:pPr>
+        <w:pStyle w:val="Compact"/>
+        <w:numPr>
+          <w:ilvl w:val="0"/>
+          <w:numId w:val="1003"/>
+        </w:numPr>
+      </w:pPr>
+      <w:r>
+        <w:t xml:space="preserve">Decompose a vector into its x- and y-components.</w:t>
+      </w:r>
+    </w:p>
+    <w:p>
+      <w:r>
+        <w:pict>
+          <v:rect style="width:0;height:1.5pt" o:hralign="center" o:hrstd="t" o:hr="t"/>
+        </w:pict>
+      </w:r>
+    </w:p>
+    <w:bookmarkEnd w:id="20"/>
+    <w:bookmarkStart w:id="25" w:name="phase-1-engage-0-12-min"/>
+    <w:p>
+      <w:pPr>
+        <w:pStyle w:val="Heading2"/>
+      </w:pPr>
+      <w:r>
+        <w:t xml:space="preserve">Phase 1 · Engage</w:t>
+      </w:r>
+      <w:r>
+        <w:t xml:space="preserve"> </w:t>
+      </w:r>
+      <w:r>
+        <w:rPr>
+          <w:i/>
+          <w:iCs/>
+        </w:rPr>
+        <w:t xml:space="preserve">(0 – 12 min)</w:t>
+      </w:r>
+    </w:p>
+    <w:p>
+      <w:pPr>
+        <w:pStyle w:val="FirstParagraph"/>
+      </w:pPr>
+      <w:r>
+        <w:rPr>
+          <w:b/>
+          <w:bCs/>
+        </w:rPr>
+        <w:t xml:space="preserve">Phenomenon-based lesson flow (PPTX slide 32):</w:t>
+      </w:r>
+      <w:r>
+        <w:t xml:space="preserve"> </w:t>
+      </w:r>
+      <w:r>
+        <w:t xml:space="preserve">show the phenomenon → notice &amp; wonder → prioritize a question through a CCC lens → develop an initial model.</w:t>
+      </w:r>
+    </w:p>
+    <w:bookmarkStart w:id="21" w:name="min-opening-connection-sel"/>
+    <w:p>
+      <w:pPr>
+        <w:pStyle w:val="Heading3"/>
+      </w:pPr>
+      <w:r>
+        <w:t xml:space="preserve">0–3 min · Opening Connection (SEL)</w:t>
+      </w:r>
+    </w:p>
+    <w:p>
+      <w:pPr>
+        <w:pStyle w:val="FirstParagraph"/>
+      </w:pPr>
+      <w:r>
+        <w:rPr>
+          <w:b/>
+          <w:bCs/>
+        </w:rPr>
+        <w:t xml:space="preserve">Restorative Circle — unit opener.</w:t>
+      </w:r>
+      <w:r>
+        <w:t xml:space="preserve"> </w:t>
+      </w:r>
+      <w:r>
+        <w:t xml:space="preserve">As students arrive, arrange chairs in a circle (or have students stand in a circle if the room is tight). Pass a small object hand-to-hand (a marker, a ball, a set of keys — anything that travels by hand). Each student answers a single prompt:</w:t>
+      </w:r>
+      <w:r>
+        <w:t xml:space="preserve"> </w:t>
+      </w:r>
+      <w:r>
+        <w:rPr>
+          <w:i/>
+          <w:iCs/>
+        </w:rPr>
+        <w:t xml:space="preserve">“What is one experience you’ve had with motion this week?”</w:t>
+      </w:r>
+      <w:r>
+        <w:t xml:space="preserve"> </w:t>
+      </w:r>
+      <w:r>
+        <w:t xml:space="preserve">Honor pass-rights — students may say</w:t>
+      </w:r>
+      <w:r>
+        <w:t xml:space="preserve"> </w:t>
+      </w:r>
+      <w:r>
+        <w:t xml:space="preserve">“pass”</w:t>
+      </w:r>
+      <w:r>
+        <w:t xml:space="preserve"> </w:t>
+      </w:r>
+      <w:r>
+        <w:t xml:space="preserve">without explanation. Do not respond to or evaluate any answer; nod, pass to the next student.</w:t>
+      </w:r>
+    </w:p>
+    <w:p>
+      <w:pPr>
+        <w:pStyle w:val="BodyText"/>
+      </w:pPr>
+      <w:r>
+        <w:rPr>
+          <w:b/>
+          <w:bCs/>
+        </w:rPr>
+        <w:t xml:space="preserve">Sample teacher language to open the circle:</w:t>
+      </w:r>
+    </w:p>
+    <w:p>
+      <w:pPr>
+        <w:pStyle w:val="BlockText"/>
+      </w:pPr>
+      <w:r>
+        <w:t xml:space="preserve">“Today we start a new unit, and we’re going to start with a circle. The point isn’t to be deep — it’s just to land in this room together before we start working. The question is: what is one experience you’ve had with motion this week? Pass-rights are honored — you can say</w:t>
+      </w:r>
+      <w:r>
+        <w:t xml:space="preserve"> </w:t>
+      </w:r>
+      <w:r>
+        <w:t xml:space="preserve">‘pass’</w:t>
+      </w:r>
+      <w:r>
+        <w:t xml:space="preserve"> </w:t>
+      </w:r>
+      <w:r>
+        <w:t xml:space="preserve">for any reason. I’ll go first, then [name to your left].”</w:t>
+      </w:r>
+    </w:p>
+    <w:p>
+      <w:pPr>
+        <w:pStyle w:val="FirstParagraph"/>
+      </w:pPr>
+      <w:r>
+        <w:rPr>
+          <w:b/>
+          <w:bCs/>
+        </w:rPr>
+        <w:t xml:space="preserve">Anticipated student responses:</w:t>
+      </w:r>
+    </w:p>
+    <w:p>
+      <w:pPr>
+        <w:pStyle w:val="Compact"/>
+        <w:numPr>
+          <w:ilvl w:val="0"/>
+          <w:numId w:val="1004"/>
+        </w:numPr>
+      </w:pPr>
+      <w:r>
+        <w:t xml:space="preserve">“I rode my bike to school”</w:t>
+      </w:r>
+      <w:r>
+        <w:t xml:space="preserve"> </w:t>
+      </w:r>
+      <w:r>
+        <w:t xml:space="preserve">— affirm; this is a real-world example you’ll come back to.</w:t>
+      </w:r>
+    </w:p>
+    <w:p>
+      <w:pPr>
+        <w:pStyle w:val="Compact"/>
+        <w:numPr>
+          <w:ilvl w:val="0"/>
+          <w:numId w:val="1004"/>
+        </w:numPr>
+      </w:pPr>
+      <w:r>
+        <w:t xml:space="preserve">“I dropped my phone”</w:t>
+      </w:r>
+      <w:r>
+        <w:t xml:space="preserve"> </w:t>
+      </w:r>
+      <w:r>
+        <w:t xml:space="preserve">— connect to Lesson 06 (freefall).</w:t>
+      </w:r>
+    </w:p>
+    <w:p>
+      <w:pPr>
+        <w:pStyle w:val="Compact"/>
+        <w:numPr>
+          <w:ilvl w:val="0"/>
+          <w:numId w:val="1004"/>
+        </w:numPr>
+      </w:pPr>
+      <w:r>
+        <w:t xml:space="preserve">“I scored a goal”</w:t>
+      </w:r>
+      <w:r>
+        <w:t xml:space="preserve"> </w:t>
+      </w:r>
+      <w:r>
+        <w:t xml:space="preserve">/</w:t>
+      </w:r>
+      <w:r>
+        <w:t xml:space="preserve"> </w:t>
+      </w:r>
+      <w:r>
+        <w:t xml:space="preserve">“I caught a ball”</w:t>
+      </w:r>
+      <w:r>
+        <w:t xml:space="preserve"> </w:t>
+      </w:r>
+      <w:r>
+        <w:t xml:space="preserve">— projectile, Lesson 09 will revisit.</w:t>
+      </w:r>
+    </w:p>
+    <w:p>
+      <w:pPr>
+        <w:pStyle w:val="Compact"/>
+        <w:numPr>
+          <w:ilvl w:val="0"/>
+          <w:numId w:val="1004"/>
+        </w:numPr>
+      </w:pPr>
+      <w:r>
+        <w:t xml:space="preserve">“Pass”</w:t>
+      </w:r>
+      <w:r>
+        <w:t xml:space="preserve"> </w:t>
+      </w:r>
+      <w:r>
+        <w:t xml:space="preserve">— fine, move on. Don’t push.</w:t>
+      </w:r>
+    </w:p>
+    <w:p>
+      <w:pPr>
+        <w:pStyle w:val="FirstParagraph"/>
+      </w:pPr>
+      <w:r>
+        <w:t xml:space="preserve">Close the circle:</w:t>
+      </w:r>
+      <w:r>
+        <w:t xml:space="preserve"> </w:t>
+      </w:r>
+      <w:r>
+        <w:rPr>
+          <w:i/>
+          <w:iCs/>
+        </w:rPr>
+        <w:t xml:space="preserve">“What’s something you noticed about what people shared?”</w:t>
+      </w:r>
+      <w:r>
+        <w:t xml:space="preserve"> </w:t>
+      </w:r>
+      <w:r>
+        <w:t xml:space="preserve">— invite one volunteer; this is the bridge to Phase 1’s content.</w:t>
+      </w:r>
+    </w:p>
+    <w:bookmarkEnd w:id="21"/>
+    <w:bookmarkStart w:id="22" w:name="min-phenomenon-hook"/>
+    <w:p>
+      <w:pPr>
+        <w:pStyle w:val="Heading3"/>
+      </w:pPr>
+      <w:r>
+        <w:t xml:space="preserve">3–8 min · Phenomenon hook</w:t>
+      </w:r>
+    </w:p>
+    <w:p>
+      <w:pPr>
+        <w:pStyle w:val="FirstParagraph"/>
+      </w:pPr>
+      <w:r>
+        <w:rPr>
+          <w:b/>
+          <w:bCs/>
+        </w:rPr>
+        <w:t xml:space="preserve">Teacher actions.</w:t>
+      </w:r>
+      <w:r>
+        <w:t xml:space="preserve"> </w:t>
+      </w:r>
+      <w:r>
+        <w:t xml:space="preserve">Project the</w:t>
+      </w:r>
+      <w:r>
+        <w:t xml:space="preserve"> </w:t>
+      </w:r>
+      <w:hyperlink r:id="rId11">
+        <w:r>
+          <w:rPr>
+            <w:rStyle w:val="Hyperlink"/>
+          </w:rPr>
+          <w:t xml:space="preserve">Physics Classroom Vector Animation</w:t>
+        </w:r>
+      </w:hyperlink>
+      <w:r>
+        <w:t xml:space="preserve">. Let it loop silently for ~30 seconds before saying anything. Resist the urge to narrate.</w:t>
+      </w:r>
+    </w:p>
+    <w:p>
+      <w:pPr>
+        <w:pStyle w:val="BodyText"/>
+      </w:pPr>
+      <w:r>
+        <w:rPr>
+          <w:b/>
+          <w:bCs/>
+        </w:rPr>
+        <w:t xml:space="preserve">Sample teacher language:</w:t>
+      </w:r>
+    </w:p>
+    <w:p>
+      <w:pPr>
+        <w:pStyle w:val="BlockText"/>
+      </w:pPr>
+      <w:r>
+        <w:t xml:space="preserve">“I’m not going to tell you what this is yet. Watch carefully. After a minute I’ll ask: what do you notice, and what do you wonder?”</w:t>
+      </w:r>
+    </w:p>
+    <w:p>
+      <w:pPr>
+        <w:pStyle w:val="FirstParagraph"/>
+      </w:pPr>
+      <w:r>
+        <w:t xml:space="preserve">After 30 seconds:</w:t>
+      </w:r>
+    </w:p>
+    <w:p>
+      <w:pPr>
+        <w:pStyle w:val="BlockText"/>
+      </w:pPr>
+      <w:r>
+        <w:t xml:space="preserve">“OK. What do you notice?”</w:t>
+      </w:r>
+    </w:p>
+    <w:p>
+      <w:pPr>
+        <w:pStyle w:val="FirstParagraph"/>
+      </w:pPr>
+      <w:r>
+        <w:rPr>
+          <w:b/>
+          <w:bCs/>
+        </w:rPr>
+        <w:t xml:space="preserve">Anticipated student responses:</w:t>
+      </w:r>
+    </w:p>
+    <w:p>
+      <w:pPr>
+        <w:pStyle w:val="Compact"/>
+        <w:numPr>
+          <w:ilvl w:val="0"/>
+          <w:numId w:val="1005"/>
+        </w:numPr>
+      </w:pPr>
+      <w:r>
+        <w:t xml:space="preserve">“There are arrows”</w:t>
+      </w:r>
+      <w:r>
+        <w:t xml:space="preserve"> </w:t>
+      </w:r>
+      <w:r>
+        <w:t xml:space="preserve">— affirm, then probe:</w:t>
+      </w:r>
+      <w:r>
+        <w:t xml:space="preserve"> </w:t>
+      </w:r>
+      <w:r>
+        <w:t xml:space="preserve">“What do the arrows do?”</w:t>
+      </w:r>
+    </w:p>
+    <w:p>
+      <w:pPr>
+        <w:pStyle w:val="Compact"/>
+        <w:numPr>
+          <w:ilvl w:val="0"/>
+          <w:numId w:val="1005"/>
+        </w:numPr>
+      </w:pPr>
+      <w:r>
+        <w:t xml:space="preserve">“They get added together head-to-tail”</w:t>
+      </w:r>
+      <w:r>
+        <w:t xml:space="preserve"> </w:t>
+      </w:r>
+      <w:r>
+        <w:t xml:space="preserve">—</w:t>
+      </w:r>
+      <w:r>
+        <w:t xml:space="preserve"> </w:t>
+      </w:r>
+      <w:r>
+        <w:rPr>
+          <w:i/>
+          <w:iCs/>
+        </w:rPr>
+        <w:t xml:space="preserve">if a student says this</w:t>
+      </w:r>
+      <w:r>
+        <w:t xml:space="preserve">, surface it for the class:</w:t>
+      </w:r>
+      <w:r>
+        <w:t xml:space="preserve"> </w:t>
+      </w:r>
+      <w:r>
+        <w:t xml:space="preserve">“That’s a great word. We’ll come back to it.”</w:t>
+      </w:r>
+    </w:p>
+    <w:p>
+      <w:pPr>
+        <w:pStyle w:val="Compact"/>
+        <w:numPr>
+          <w:ilvl w:val="0"/>
+          <w:numId w:val="1005"/>
+        </w:numPr>
+      </w:pPr>
+      <w:r>
+        <w:t xml:space="preserve">“The dashed arrow is the resultant”</w:t>
+      </w:r>
+      <w:r>
+        <w:t xml:space="preserve"> </w:t>
+      </w:r>
+      <w:r>
+        <w:t xml:space="preserve">— rare but possible.</w:t>
+      </w:r>
+      <w:r>
+        <w:t xml:space="preserve"> </w:t>
+      </w:r>
+      <w:r>
+        <w:rPr>
+          <w:i/>
+          <w:iCs/>
+        </w:rPr>
+        <w:t xml:space="preserve">Do not validate as</w:t>
+      </w:r>
+      <w:r>
+        <w:rPr>
+          <w:i/>
+          <w:iCs/>
+        </w:rPr>
+        <w:t xml:space="preserve"> </w:t>
+      </w:r>
+      <w:r>
+        <w:rPr>
+          <w:i/>
+          <w:iCs/>
+        </w:rPr>
+        <w:t xml:space="preserve">‘right’</w:t>
+      </w:r>
+      <w:r>
+        <w:rPr>
+          <w:i/>
+          <w:iCs/>
+        </w:rPr>
+        <w:t xml:space="preserve"> </w:t>
+      </w:r>
+      <w:r>
+        <w:rPr>
+          <w:i/>
+          <w:iCs/>
+        </w:rPr>
+        <w:t xml:space="preserve">yet.</w:t>
+      </w:r>
+      <w:r>
+        <w:t xml:space="preserve"> </w:t>
+      </w:r>
+      <w:r>
+        <w:t xml:space="preserve">Instead:</w:t>
+      </w:r>
+      <w:r>
+        <w:t xml:space="preserve"> </w:t>
+      </w:r>
+      <w:r>
+        <w:t xml:space="preserve">“Interesting — what makes you think that’s a special arrow?”</w:t>
+      </w:r>
+    </w:p>
+    <w:p>
+      <w:pPr>
+        <w:pStyle w:val="Compact"/>
+        <w:numPr>
+          <w:ilvl w:val="0"/>
+          <w:numId w:val="1005"/>
+        </w:numPr>
+      </w:pPr>
+      <w:r>
+        <w:t xml:space="preserve">“It looks like the order doesn’t matter”</w:t>
+      </w:r>
+      <w:r>
+        <w:t xml:space="preserve"> </w:t>
+      </w:r>
+      <w:r>
+        <w:t xml:space="preserve">— note this; we’ll come back to it in Phase 3.</w:t>
+      </w:r>
+    </w:p>
+    <w:bookmarkEnd w:id="22"/>
+    <w:bookmarkStart w:id="23" w:name="min-notice-wonder-turn-and-talk-1"/>
+    <w:p>
+      <w:pPr>
+        <w:pStyle w:val="Heading3"/>
+      </w:pPr>
+      <w:r>
+        <w:t xml:space="preserve">8–12 min · Notice &amp; Wonder + Turn-and-Talk #1</w:t>
+      </w:r>
+    </w:p>
+    <w:p>
+      <w:pPr>
+        <w:pStyle w:val="FirstParagraph"/>
+      </w:pPr>
+      <w:r>
+        <w:t xml:space="preserve">Capture two columns on the board:</w:t>
+      </w:r>
+      <w:r>
+        <w:t xml:space="preserve"> </w:t>
+      </w:r>
+      <w:r>
+        <w:rPr>
+          <w:b/>
+          <w:bCs/>
+        </w:rPr>
+        <w:t xml:space="preserve">Notice</w:t>
+      </w:r>
+      <w:r>
+        <w:t xml:space="preserve"> </w:t>
+      </w:r>
+      <w:r>
+        <w:t xml:space="preserve">and</w:t>
+      </w:r>
+      <w:r>
+        <w:t xml:space="preserve"> </w:t>
+      </w:r>
+      <w:r>
+        <w:rPr>
+          <w:b/>
+          <w:bCs/>
+        </w:rPr>
+        <w:t xml:space="preserve">Wonder</w:t>
+      </w:r>
+      <w:r>
+        <w:t xml:space="preserve">. Take 4–5 student observations (mix of voices). Then transition:</w:t>
+      </w:r>
+    </w:p>
+    <w:p>
+      <w:pPr>
+        <w:pStyle w:val="BlockText"/>
+      </w:pPr>
+      <w:r>
+        <w:t xml:space="preserve">“Turn to your partner. One thing you noticed about the arrows. One thing you wondered. Pick a wondering you’d like the class to figure out today.”</w:t>
+      </w:r>
+    </w:p>
+    <w:p>
+      <w:pPr>
+        <w:pStyle w:val="FirstParagraph"/>
+      </w:pPr>
+      <w:r>
+        <w:t xml:space="preserve">After 90 seconds, take 2–3 wonderings. Write them on the board. The most useful ones to surface:</w:t>
+      </w:r>
+    </w:p>
+    <w:p>
+      <w:pPr>
+        <w:pStyle w:val="Compact"/>
+        <w:numPr>
+          <w:ilvl w:val="0"/>
+          <w:numId w:val="1006"/>
+        </w:numPr>
+      </w:pPr>
+      <w:r>
+        <w:t xml:space="preserve">“Why is the dashed arrow shorter than the two solid arrows added together?”</w:t>
+      </w:r>
+    </w:p>
+    <w:p>
+      <w:pPr>
+        <w:pStyle w:val="Compact"/>
+        <w:numPr>
+          <w:ilvl w:val="0"/>
+          <w:numId w:val="1006"/>
+        </w:numPr>
+      </w:pPr>
+      <w:r>
+        <w:t xml:space="preserve">“Does it matter which arrow comes first?”</w:t>
+      </w:r>
+    </w:p>
+    <w:p>
+      <w:pPr>
+        <w:pStyle w:val="Compact"/>
+        <w:numPr>
+          <w:ilvl w:val="0"/>
+          <w:numId w:val="1006"/>
+        </w:numPr>
+      </w:pPr>
+      <w:r>
+        <w:t xml:space="preserve">“How would you tell someone how to draw the dashed arrow?”</w:t>
+      </w:r>
+    </w:p>
+    <w:p>
+      <w:pPr>
+        <w:pStyle w:val="FirstParagraph"/>
+      </w:pPr>
+      <w:r>
+        <w:rPr>
+          <w:b/>
+          <w:bCs/>
+        </w:rPr>
+        <w:t xml:space="preserve">CCC framing.</w:t>
+      </w:r>
+      <w:r>
+        <w:t xml:space="preserve"> </w:t>
+      </w:r>
+      <w:r>
+        <w:t xml:space="preserve">Briefly note:</w:t>
+      </w:r>
+      <w:r>
+        <w:t xml:space="preserve"> </w:t>
+      </w:r>
+      <w:r>
+        <w:t xml:space="preserve">“We’re going to investigate</w:t>
+      </w:r>
+      <w:r>
+        <w:t xml:space="preserve"> </w:t>
+      </w:r>
+      <w:r>
+        <w:rPr>
+          <w:i/>
+          <w:iCs/>
+        </w:rPr>
+        <w:t xml:space="preserve">cause and effect</w:t>
+      </w:r>
+      <w:r>
+        <w:t xml:space="preserve"> </w:t>
+      </w:r>
+      <w:r>
+        <w:t xml:space="preserve">— when two forces or two motions combine, what determines the result? It’s not just about how big each one is.”</w:t>
+      </w:r>
+    </w:p>
+    <w:bookmarkEnd w:id="23"/>
+    <w:bookmarkStart w:id="24" w:name="bridge-to-phase-2"/>
+    <w:p>
+      <w:pPr>
+        <w:pStyle w:val="Heading3"/>
+      </w:pPr>
+      <w:r>
+        <w:t xml:space="preserve">Bridge to Phase 2</w:t>
+      </w:r>
+    </w:p>
+    <w:p>
+      <w:pPr>
+        <w:pStyle w:val="FirstParagraph"/>
+      </w:pPr>
+      <w:r>
+        <w:t xml:space="preserve">By the end of Phase 1, every student should have a written</w:t>
+      </w:r>
+      <w:r>
+        <w:t xml:space="preserve"> </w:t>
+      </w:r>
+      <w:r>
+        <w:rPr>
+          <w:b/>
+          <w:bCs/>
+        </w:rPr>
+        <w:t xml:space="preserve">initial model</w:t>
+      </w:r>
+      <w:r>
+        <w:t xml:space="preserve"> </w:t>
+      </w:r>
+      <w:r>
+        <w:t xml:space="preserve">— a sketch in their notebook answering:</w:t>
+      </w:r>
+      <w:r>
+        <w:t xml:space="preserve"> </w:t>
+      </w:r>
+      <w:r>
+        <w:rPr>
+          <w:i/>
+          <w:iCs/>
+        </w:rPr>
+        <w:t xml:space="preserve">“If arrow A points 4 squares right and arrow B points 3 squares up, where does the second arrow’s tip end up — and how would you describe that ending point in words?”</w:t>
+      </w:r>
+    </w:p>
+    <w:p>
+      <w:r>
+        <w:pict>
+          <v:rect style="width:0;height:1.5pt" o:hralign="center" o:hrstd="t" o:hr="t"/>
+        </w:pict>
+      </w:r>
+    </w:p>
+    <w:bookmarkEnd w:id="24"/>
+    <w:bookmarkEnd w:id="25"/>
+    <w:bookmarkStart w:id="29" w:name="phase-2-explore-12-32-min"/>
+    <w:p>
+      <w:pPr>
+        <w:pStyle w:val="Heading2"/>
+      </w:pPr>
+      <w:r>
+        <w:t xml:space="preserve">Phase 2 · Explore</w:t>
+      </w:r>
+      <w:r>
+        <w:t xml:space="preserve"> </w:t>
+      </w:r>
+      <w:r>
+        <w:rPr>
+          <w:i/>
+          <w:iCs/>
+        </w:rPr>
+        <w:t xml:space="preserve">(12 – 32 min)</w:t>
+      </w:r>
+    </w:p>
+    <w:p>
+      <w:pPr>
+        <w:pStyle w:val="FirstParagraph"/>
+      </w:pPr>
+      <w:r>
+        <w:rPr>
+          <w:b/>
+          <w:bCs/>
+        </w:rPr>
+        <w:t xml:space="preserve">Investigation.</w:t>
+      </w:r>
+      <w:r>
+        <w:t xml:space="preserve"> </w:t>
+      </w:r>
+      <w:r>
+        <w:t xml:space="preserve">Students engage with the phenomenon through hands-on Vector Golf stations and the slider-based interactive. Teacher walks but does not solve.</w:t>
+      </w:r>
+    </w:p>
+    <w:bookmarkStart w:id="26" w:name="min-initial-model-silent-individual"/>
+    <w:p>
+      <w:pPr>
+        <w:pStyle w:val="Heading3"/>
+      </w:pPr>
+      <w:r>
+        <w:t xml:space="preserve">12–17 min · Initial Model (silent / individual)</w:t>
+      </w:r>
+    </w:p>
+    <w:p>
+      <w:pPr>
+        <w:pStyle w:val="FirstParagraph"/>
+      </w:pPr>
+      <w:r>
+        <w:t xml:space="preserve">Distribute graph paper. Students sketch their initial model individually. Specific prompt on the board:</w:t>
+      </w:r>
+    </w:p>
+    <w:p>
+      <w:pPr>
+        <w:pStyle w:val="BlockText"/>
+      </w:pPr>
+      <w:r>
+        <w:rPr>
+          <w:i/>
+          <w:iCs/>
+        </w:rPr>
+        <w:t xml:space="preserve">“Arrow A points 4 squares right. Arrow B points 3 squares up. Draw both arrows head-to-tail starting from the origin. Where does B’s tip end up? In one sentence, describe that ending point.”</w:t>
+      </w:r>
+    </w:p>
+    <w:p>
+      <w:pPr>
+        <w:pStyle w:val="FirstParagraph"/>
+      </w:pPr>
+      <w:r>
+        <w:t xml:space="preserve">This is silent work. No collaboration yet. The point is to surface each student’s</w:t>
+      </w:r>
+      <w:r>
+        <w:t xml:space="preserve"> </w:t>
+      </w:r>
+      <w:r>
+        <w:rPr>
+          <w:i/>
+          <w:iCs/>
+        </w:rPr>
+        <w:t xml:space="preserve">current</w:t>
+      </w:r>
+      <w:r>
+        <w:t xml:space="preserve"> </w:t>
+      </w:r>
+      <w:r>
+        <w:t xml:space="preserve">mental model — including misconceptions — before the investigation surfaces the correct rule.</w:t>
+      </w:r>
+    </w:p>
+    <w:p>
+      <w:pPr>
+        <w:pStyle w:val="BodyText"/>
+      </w:pPr>
+      <w:r>
+        <w:rPr>
+          <w:b/>
+          <w:bCs/>
+        </w:rPr>
+        <w:t xml:space="preserve">What to look for during the silent work:</w:t>
+      </w:r>
+    </w:p>
+    <w:p>
+      <w:pPr>
+        <w:pStyle w:val="Compact"/>
+        <w:numPr>
+          <w:ilvl w:val="0"/>
+          <w:numId w:val="1007"/>
+        </w:numPr>
+      </w:pPr>
+      <w:r>
+        <w:t xml:space="preserve">Students who add 4 + 3 = 7 (additivity misconception — they’re treating vectors like scalars). Mark these mentally; you’ll surface them in Phase 3.</w:t>
+      </w:r>
+    </w:p>
+    <w:p>
+      <w:pPr>
+        <w:pStyle w:val="Compact"/>
+        <w:numPr>
+          <w:ilvl w:val="0"/>
+          <w:numId w:val="1007"/>
+        </w:numPr>
+      </w:pPr>
+      <w:r>
+        <w:t xml:space="preserve">Students who draw the resultant correctly but can’t articulate it in words. Mark these too — they have intuition without vocabulary, which is exactly the gap vocabulary closes.</w:t>
+      </w:r>
+    </w:p>
+    <w:bookmarkEnd w:id="26"/>
+    <w:bookmarkStart w:id="27" w:name="Xa9d8072435d74b2b497e4806129d2235ca7db45"/>
+    <w:p>
+      <w:pPr>
+        <w:pStyle w:val="Heading3"/>
+      </w:pPr>
+      <w:r>
+        <w:t xml:space="preserve">17–32 min · Investigation — Vector Golf stations (Active Learning)</w:t>
+      </w:r>
+    </w:p>
+    <w:p>
+      <w:pPr>
+        <w:pStyle w:val="FirstParagraph"/>
+      </w:pPr>
+      <w:r>
+        <w:rPr>
+          <w:b/>
+          <w:bCs/>
+        </w:rPr>
+        <w:t xml:space="preserve">Setup.</w:t>
+      </w:r>
+      <w:r>
+        <w:t xml:space="preserve"> </w:t>
+      </w:r>
+      <w:r>
+        <w:t xml:space="preserve">Four stations around the room, each with a different</w:t>
+      </w:r>
+      <w:r>
+        <w:t xml:space="preserve"> </w:t>
+      </w:r>
+      <w:r>
+        <w:t xml:space="preserve">“course”</w:t>
+      </w:r>
+      <w:r>
+        <w:t xml:space="preserve"> </w:t>
+      </w:r>
+      <w:r>
+        <w:t xml:space="preserve">(a starting point and a target on a coordinate grid). Each station has chart paper at standing height (vertical non-permanent surface lite). Form</w:t>
+      </w:r>
+      <w:r>
+        <w:t xml:space="preserve"> </w:t>
+      </w:r>
+      <w:r>
+        <w:rPr>
+          <w:b/>
+          <w:bCs/>
+        </w:rPr>
+        <w:t xml:space="preserve">random groups of 3</w:t>
+      </w:r>
+      <w:r>
+        <w:t xml:space="preserve"> </w:t>
+      </w:r>
+      <w:r>
+        <w:t xml:space="preserve">using a deck of cards: shuffle, deal one card per student face-down; same-suit groups (clubs together, diamonds together, etc.). The randomness signals that</w:t>
+      </w:r>
+      <w:r>
+        <w:t xml:space="preserve"> </w:t>
+      </w:r>
+      <w:r>
+        <w:rPr>
+          <w:i/>
+          <w:iCs/>
+        </w:rPr>
+        <w:t xml:space="preserve">anyone</w:t>
+      </w:r>
+      <w:r>
+        <w:t xml:space="preserve"> </w:t>
+      </w:r>
+      <w:r>
+        <w:t xml:space="preserve">can think with</w:t>
+      </w:r>
+      <w:r>
+        <w:t xml:space="preserve"> </w:t>
+      </w:r>
+      <w:r>
+        <w:rPr>
+          <w:i/>
+          <w:iCs/>
+        </w:rPr>
+        <w:t xml:space="preserve">anyone</w:t>
+      </w:r>
+      <w:r>
+        <w:t xml:space="preserve">.</w:t>
+      </w:r>
+    </w:p>
+    <w:p>
+      <w:pPr>
+        <w:pStyle w:val="BodyText"/>
+      </w:pPr>
+      <w:r>
+        <w:rPr>
+          <w:b/>
+          <w:bCs/>
+        </w:rPr>
+        <w:t xml:space="preserve">Three-minute rotations.</w:t>
+      </w:r>
+      <w:r>
+        <w:t xml:space="preserve"> </w:t>
+      </w:r>
+      <w:r>
+        <w:t xml:space="preserve">At each station, the group must use head-to-tail vector addition to plot a sequence of arrows that lands on the target. They leave their solution on the chart paper for the next group to verify. Walk the room and ask the discussion prompts; resist solving — let groups argue.</w:t>
+      </w:r>
+    </w:p>
+    <w:p>
+      <w:pPr>
+        <w:pStyle w:val="BodyText"/>
+      </w:pPr>
+      <w:r>
+        <w:rPr>
+          <w:b/>
+          <w:bCs/>
+        </w:rPr>
+        <w:t xml:space="preserve">Sample teacher facilitation language during station work:</w:t>
+      </w:r>
+    </w:p>
+    <w:p>
+      <w:pPr>
+        <w:pStyle w:val="BlockText"/>
+      </w:pPr>
+      <w:r>
+        <w:t xml:space="preserve">“What’s your evidence that arrow lands on the target?”</w:t>
+      </w:r>
+      <w:r>
+        <w:t xml:space="preserve"> </w:t>
+      </w:r>
+      <w:r>
+        <w:t xml:space="preserve">“Could you have gotten there with fewer arrows? More?”</w:t>
+      </w:r>
+      <w:r>
+        <w:t xml:space="preserve"> </w:t>
+      </w:r>
+      <w:r>
+        <w:t xml:space="preserve">“What does the group BEFORE you have — does their solution work?”</w:t>
+      </w:r>
+    </w:p>
+    <w:bookmarkEnd w:id="27"/>
+    <w:bookmarkStart w:id="28" w:name="teacher-facilitation-during-explore"/>
+    <w:p>
+      <w:pPr>
+        <w:pStyle w:val="Heading3"/>
+      </w:pPr>
+      <w:r>
+        <w:t xml:space="preserve">Teacher facilitation during Explore</w:t>
+      </w:r>
+    </w:p>
+    <w:p>
+      <w:pPr>
+        <w:pStyle w:val="Compact"/>
+        <w:numPr>
+          <w:ilvl w:val="0"/>
+          <w:numId w:val="1008"/>
+        </w:numPr>
+      </w:pPr>
+      <w:r>
+        <w:rPr>
+          <w:b/>
+          <w:bCs/>
+        </w:rPr>
+        <w:t xml:space="preserve">What to look for</w:t>
+      </w:r>
+      <w:r>
+        <w:t xml:space="preserve"> </w:t>
+      </w:r>
+      <w:r>
+        <w:t xml:space="preserve">— groups discovering the head-to-tail rule by doing it. The</w:t>
+      </w:r>
+      <w:r>
+        <w:t xml:space="preserve"> </w:t>
+      </w:r>
+      <w:r>
+        <w:t xml:space="preserve">“aha”</w:t>
+      </w:r>
+      <w:r>
+        <w:t xml:space="preserve"> </w:t>
+      </w:r>
+      <w:r>
+        <w:t xml:space="preserve">moment is when a group realizes that A + B and B + A land in the same place.</w:t>
+      </w:r>
+    </w:p>
+    <w:p>
+      <w:pPr>
+        <w:pStyle w:val="Compact"/>
+        <w:numPr>
+          <w:ilvl w:val="0"/>
+          <w:numId w:val="1008"/>
+        </w:numPr>
+      </w:pPr>
+      <w:r>
+        <w:rPr>
+          <w:b/>
+          <w:bCs/>
+        </w:rPr>
+        <w:t xml:space="preserve">What to resist</w:t>
+      </w:r>
+      <w:r>
+        <w:t xml:space="preserve"> </w:t>
+      </w:r>
+      <w:r>
+        <w:t xml:space="preserve">— do NOT explain the formal rule yet. The purpose of Phase 2 is for students to surface the pattern themselves. Resist the urge to validate</w:t>
+      </w:r>
+      <w:r>
+        <w:t xml:space="preserve"> </w:t>
+      </w:r>
+      <w:r>
+        <w:t xml:space="preserve">“right answers”</w:t>
+      </w:r>
+      <w:r>
+        <w:t xml:space="preserve"> </w:t>
+      </w:r>
+      <w:r>
+        <w:t xml:space="preserve">mid-investigation.</w:t>
+      </w:r>
+    </w:p>
+    <w:p>
+      <w:pPr>
+        <w:pStyle w:val="Compact"/>
+        <w:numPr>
+          <w:ilvl w:val="0"/>
+          <w:numId w:val="1008"/>
+        </w:numPr>
+      </w:pPr>
+      <w:r>
+        <w:rPr>
+          <w:b/>
+          <w:bCs/>
+        </w:rPr>
+        <w:t xml:space="preserve">What to redirect</w:t>
+      </w:r>
+      <w:r>
+        <w:t xml:space="preserve"> </w:t>
+      </w:r>
+      <w:r>
+        <w:t xml:space="preserve">— if a group is stuck, redirect with:</w:t>
+      </w:r>
+      <w:r>
+        <w:t xml:space="preserve"> </w:t>
+      </w:r>
+      <w:r>
+        <w:t xml:space="preserve">“What did the previous group try? What’s different about your course?”</w:t>
+      </w:r>
+      <w:r>
+        <w:t xml:space="preserve"> </w:t>
+      </w:r>
+      <w:r>
+        <w:t xml:space="preserve">If a group thinks the order of vectors matters for the resultant, let them test it — they will discover the commutativity themselves.</w:t>
+      </w:r>
+    </w:p>
+    <w:p>
+      <w:r>
+        <w:pict>
+          <v:rect style="width:0;height:1.5pt" o:hralign="center" o:hrstd="t" o:hr="t"/>
+        </w:pict>
+      </w:r>
+    </w:p>
+    <w:bookmarkEnd w:id="28"/>
+    <w:bookmarkEnd w:id="29"/>
+    <w:bookmarkStart w:id="33" w:name="phase-3-explain-32-37-min"/>
+    <w:p>
+      <w:pPr>
+        <w:pStyle w:val="Heading2"/>
+      </w:pPr>
+      <w:r>
+        <w:t xml:space="preserve">Phase 3 · Explain</w:t>
+      </w:r>
+      <w:r>
+        <w:t xml:space="preserve"> </w:t>
+      </w:r>
+      <w:r>
+        <w:rPr>
+          <w:i/>
+          <w:iCs/>
+        </w:rPr>
+        <w:t xml:space="preserve">(32 – 37 min)</w:t>
+      </w:r>
+    </w:p>
+    <w:p>
+      <w:pPr>
+        <w:pStyle w:val="FirstParagraph"/>
+      </w:pPr>
+      <w:r>
+        <w:rPr>
+          <w:b/>
+          <w:bCs/>
+        </w:rPr>
+        <w:t xml:space="preserve">Sense-making + class consensus.</w:t>
+      </w:r>
+      <w:r>
+        <w:t xml:space="preserve"> </w:t>
+      </w:r>
+      <w:r>
+        <w:t xml:space="preserve">Students articulate the pattern they discovered. The teacher names the formal vocabulary (≤ 3 terms) —</w:t>
+      </w:r>
+      <w:r>
+        <w:t xml:space="preserve"> </w:t>
+      </w:r>
+      <w:r>
+        <w:rPr>
+          <w:i/>
+          <w:iCs/>
+        </w:rPr>
+        <w:t xml:space="preserve">only after</w:t>
+      </w:r>
+      <w:r>
+        <w:t xml:space="preserve"> </w:t>
+      </w:r>
+      <w:r>
+        <w:t xml:space="preserve">students have done the explaining work themselves. Per NYSSLS observation checklist item 5, vocabulary lands in the second half of the lesson.</w:t>
+      </w:r>
+    </w:p>
+    <w:bookmarkStart w:id="30" w:name="min-turn-and-talk-2-class-consensus"/>
+    <w:p>
+      <w:pPr>
+        <w:pStyle w:val="Heading3"/>
+      </w:pPr>
+      <w:r>
+        <w:t xml:space="preserve">32–35 min · Turn-and-Talk #2 + class consensus</w:t>
+      </w:r>
+    </w:p>
+    <w:p>
+      <w:pPr>
+        <w:pStyle w:val="FirstParagraph"/>
+      </w:pPr>
+      <w:r>
+        <w:t xml:space="preserve">Bring the class back together at one chart paper. Pick a group’s solution that shows two arrows (A and B) with their resultant. Ask:</w:t>
+      </w:r>
+    </w:p>
+    <w:p>
+      <w:pPr>
+        <w:pStyle w:val="BlockText"/>
+      </w:pPr>
+      <w:r>
+        <w:t xml:space="preserve">“If A points right (magnitude 4) and B points up (magnitude 3), why does the resultant come out to 5 — not 7? Use the grid to convince your partner.”</w:t>
+      </w:r>
+    </w:p>
+    <w:p>
+      <w:pPr>
+        <w:pStyle w:val="FirstParagraph"/>
+      </w:pPr>
+      <w:r>
+        <w:t xml:space="preserve">After 90 seconds, take volunteers. The target consensus statement:</w:t>
+      </w:r>
+    </w:p>
+    <w:p>
+      <w:pPr>
+        <w:pStyle w:val="BlockText"/>
+      </w:pPr>
+      <w:r>
+        <w:t xml:space="preserve">“When two vectors are perpendicular, the resultant’s</w:t>
+      </w:r>
+      <w:r>
+        <w:t xml:space="preserve"> </w:t>
+      </w:r>
+      <w:r>
+        <w:rPr>
+          <w:i/>
+          <w:iCs/>
+        </w:rPr>
+        <w:t xml:space="preserve">magnitude</w:t>
+      </w:r>
+      <w:r>
+        <w:t xml:space="preserve"> </w:t>
+      </w:r>
+      <w:r>
+        <w:t xml:space="preserve">follows the Pythagorean theorem: c² = a² + b². When they’re parallel, the magnitudes add. When they’re anti-parallel, they subtract.”</w:t>
+      </w:r>
+    </w:p>
+    <w:p>
+      <w:pPr>
+        <w:pStyle w:val="FirstParagraph"/>
+      </w:pPr>
+      <w:r>
+        <w:t xml:space="preserve">If no student arrives at the Pythagorean connection, prompt:</w:t>
+      </w:r>
+      <w:r>
+        <w:t xml:space="preserve"> </w:t>
+      </w:r>
+      <w:r>
+        <w:t xml:space="preserve">“Look at the triangle the three arrows form. What do we know about right triangles?”</w:t>
+      </w:r>
+    </w:p>
+    <w:bookmarkEnd w:id="30"/>
+    <w:bookmarkStart w:id="31" w:name="min-vocabulary-introduction-3-terms"/>
+    <w:p>
+      <w:pPr>
+        <w:pStyle w:val="Heading3"/>
+      </w:pPr>
+      <w:r>
+        <w:t xml:space="preserve">35–37 min · Vocabulary introduction (≤ 3 terms)</w:t>
+      </w:r>
+    </w:p>
+    <w:p>
+      <w:pPr>
+        <w:pStyle w:val="FirstParagraph"/>
+      </w:pPr>
+      <w:r>
+        <w:t xml:space="preserve">Now — and only now — name the three formal terms. Write them on the board with definitions and an example.</w:t>
+      </w:r>
+    </w:p>
+    <w:p>
+      <w:pPr>
+        <w:pStyle w:val="BodyText"/>
+      </w:pPr>
+      <w:r>
+        <w:rPr>
+          <w:b/>
+          <w:bCs/>
+        </w:rPr>
+        <w:t xml:space="preserve">Sample teacher language:</w:t>
+      </w:r>
+    </w:p>
+    <w:p>
+      <w:pPr>
+        <w:pStyle w:val="BlockText"/>
+      </w:pPr>
+      <w:r>
+        <w:t xml:space="preserve">“When a quantity has both a</w:t>
+      </w:r>
+      <w:r>
+        <w:t xml:space="preserve"> </w:t>
+      </w:r>
+      <w:r>
+        <w:rPr>
+          <w:i/>
+          <w:iCs/>
+        </w:rPr>
+        <w:t xml:space="preserve">size</w:t>
+      </w:r>
+      <w:r>
+        <w:t xml:space="preserve"> </w:t>
+      </w:r>
+      <w:r>
+        <w:t xml:space="preserve">and a</w:t>
       </w:r>
       <w:r>
         <w:t xml:space="preserve"> </w:t>
@@ -313,39 +1872,938 @@
         <w:t xml:space="preserve">direction</w:t>
       </w:r>
       <w:r>
+        <w:t xml:space="preserve">, we call that a</w:t>
+      </w:r>
+      <w:r>
         <w:t xml:space="preserve"> </w:t>
       </w:r>
       <w:r>
-        <w:t xml:space="preserve">of a force changes motion, not just its magnitude. (One-line teacher read-aloud:</w:t>
+        <w:rPr>
+          <w:b/>
+          <w:bCs/>
+        </w:rPr>
+        <w:t xml:space="preserve">vector</w:t>
+      </w:r>
+      <w:r>
+        <w:t xml:space="preserve">. The size is its</w:t>
       </w:r>
       <w:r>
         <w:t xml:space="preserve"> </w:t>
       </w:r>
       <w:r>
-        <w:t xml:space="preserve">“When two pushes act on the same object, the</w:t>
+        <w:rPr>
+          <w:b/>
+          <w:bCs/>
+        </w:rPr>
+        <w:t xml:space="preserve">magnitude</w:t>
+      </w:r>
+      <w:r>
+        <w:t xml:space="preserve">. The way it points is its</w:t>
       </w:r>
       <w:r>
         <w:t xml:space="preserve"> </w:t>
       </w:r>
+      <w:r>
+        <w:rPr>
+          <w:b/>
+          <w:bCs/>
+        </w:rPr>
+        <w:t xml:space="preserve">direction</w:t>
+      </w:r>
+      <w:r>
+        <w:t xml:space="preserve">. Today we worked with vectors of length 4 and 3 that pointed perpendicular to each other; their resultant had magnitude 5 and a specific direction.”</w:t>
+      </w:r>
+    </w:p>
+    <w:bookmarkEnd w:id="31"/>
+    <w:bookmarkStart w:id="32" w:name="discussion-prompts-to-deploy-here"/>
+    <w:p>
+      <w:pPr>
+        <w:pStyle w:val="Heading3"/>
+      </w:pPr>
+      <w:r>
+        <w:t xml:space="preserve">Discussion prompts to deploy here</w:t>
+      </w:r>
+    </w:p>
+    <w:p>
+      <w:pPr>
+        <w:pStyle w:val="Compact"/>
+        <w:numPr>
+          <w:ilvl w:val="0"/>
+          <w:numId w:val="1009"/>
+        </w:numPr>
+      </w:pPr>
+      <w:r>
+        <w:t xml:space="preserve">“When two vectors point the same direction, what happens to their resultant? When they point opposite? When they’re perpendicular?”</w:t>
+      </w:r>
+    </w:p>
+    <w:p>
+      <w:pPr>
+        <w:pStyle w:val="Compact"/>
+        <w:numPr>
+          <w:ilvl w:val="1"/>
+          <w:numId w:val="1010"/>
+        </w:numPr>
+      </w:pPr>
       <w:r>
         <w:rPr>
           <w:i/>
           <w:iCs/>
         </w:rPr>
+        <w:t xml:space="preserve">Sample student response:</w:t>
+      </w:r>
+      <w:r>
+        <w:t xml:space="preserve"> </w:t>
+      </w:r>
+      <w:r>
+        <w:t xml:space="preserve">“When perpendicular, the resultant is the diagonal of a rectangle, so we use Pythagoras to get its size.”</w:t>
+      </w:r>
+    </w:p>
+    <w:p>
+      <w:pPr>
+        <w:pStyle w:val="Compact"/>
+        <w:numPr>
+          <w:ilvl w:val="0"/>
+          <w:numId w:val="1009"/>
+        </w:numPr>
+      </w:pPr>
+      <w:r>
+        <w:t xml:space="preserve">“Could two different pairs of vectors give the same resultant? How would you draw an example?”</w:t>
+      </w:r>
+    </w:p>
+    <w:p>
+      <w:pPr>
+        <w:pStyle w:val="Compact"/>
+        <w:numPr>
+          <w:ilvl w:val="0"/>
+          <w:numId w:val="1009"/>
+        </w:numPr>
+      </w:pPr>
+      <w:r>
+        <w:t xml:space="preserve">“If you swap A and B in head-to-tail addition, does the resultant change? Why or why not?”</w:t>
+      </w:r>
+    </w:p>
+    <w:p>
+      <w:r>
+        <w:pict>
+          <v:rect style="width:0;height:1.5pt" o:hralign="center" o:hrstd="t" o:hr="t"/>
+        </w:pict>
+      </w:r>
+    </w:p>
+    <w:bookmarkEnd w:id="32"/>
+    <w:bookmarkEnd w:id="33"/>
+    <w:bookmarkStart w:id="36" w:name="phase-4-elaborate-37-40-min"/>
+    <w:p>
+      <w:pPr>
+        <w:pStyle w:val="Heading2"/>
+      </w:pPr>
+      <w:r>
+        <w:t xml:space="preserve">Phase 4 · Elaborate</w:t>
+      </w:r>
+      <w:r>
+        <w:t xml:space="preserve"> </w:t>
+      </w:r>
+      <w:r>
+        <w:rPr>
+          <w:i/>
+          <w:iCs/>
+        </w:rPr>
+        <w:t xml:space="preserve">(37 – 40 min)</w:t>
+      </w:r>
+    </w:p>
+    <w:p>
+      <w:pPr>
+        <w:pStyle w:val="FirstParagraph"/>
+      </w:pPr>
+      <w:r>
+        <w:rPr>
+          <w:b/>
+          <w:bCs/>
+        </w:rPr>
+        <w:t xml:space="preserve">Apply the new ideas to the original phenomenon.</w:t>
+      </w:r>
+      <w:r>
+        <w:t xml:space="preserve"> </w:t>
+      </w:r>
+      <w:r>
+        <w:t xml:space="preserve">Students return to their initial model from Phase 2 and revise it using today’s vocabulary and the pattern they surfaced.</w:t>
+      </w:r>
+    </w:p>
+    <w:bookmarkStart w:id="34" w:name="min-revise-the-model"/>
+    <w:p>
+      <w:pPr>
+        <w:pStyle w:val="Heading3"/>
+      </w:pPr>
+      <w:r>
+        <w:t xml:space="preserve">37–39 min · Revise the model</w:t>
+      </w:r>
+    </w:p>
+    <w:p>
+      <w:pPr>
+        <w:pStyle w:val="FirstParagraph"/>
+      </w:pPr>
+      <w:r>
+        <w:t xml:space="preserve">Each student reopens their initial model sketch from Phase 2. Specific prompt on the board:</w:t>
+      </w:r>
+    </w:p>
+    <w:p>
+      <w:pPr>
+        <w:pStyle w:val="BlockText"/>
+      </w:pPr>
+      <w:r>
+        <w:rPr>
+          <w:i/>
+          <w:iCs/>
+        </w:rPr>
+        <w:t xml:space="preserve">“Update your sketch. Use the words</w:t>
+      </w:r>
+      <w:r>
+        <w:rPr>
+          <w:i/>
+          <w:iCs/>
+        </w:rPr>
+        <w:t xml:space="preserve"> </w:t>
+      </w:r>
+      <w:r>
+        <w:rPr>
+          <w:b/>
+          <w:bCs/>
+          <w:i/>
+          <w:iCs/>
+        </w:rPr>
+        <w:t xml:space="preserve">magnitude</w:t>
+      </w:r>
+      <w:r>
+        <w:rPr>
+          <w:i/>
+          <w:iCs/>
+        </w:rPr>
+        <w:t xml:space="preserve"> </w:t>
+      </w:r>
+      <w:r>
+        <w:rPr>
+          <w:i/>
+          <w:iCs/>
+        </w:rPr>
+        <w:t xml:space="preserve">and</w:t>
+      </w:r>
+      <w:r>
+        <w:rPr>
+          <w:i/>
+          <w:iCs/>
+        </w:rPr>
+        <w:t xml:space="preserve"> </w:t>
+      </w:r>
+      <w:r>
+        <w:rPr>
+          <w:b/>
+          <w:bCs/>
+          <w:i/>
+          <w:iCs/>
+        </w:rPr>
         <w:t xml:space="preserve">direction</w:t>
       </w:r>
       <w:r>
+        <w:rPr>
+          <w:i/>
+          <w:iCs/>
+        </w:rPr>
         <w:t xml:space="preserve"> </w:t>
       </w:r>
       <w:r>
-        <w:t xml:space="preserve">each push points decides where the object ends up — not just how strong each push is.”</w:t>
-      </w:r>
-      <w:r>
-        <w:t xml:space="preserve">)</w:t>
+        <w:rPr>
+          <w:i/>
+          <w:iCs/>
+        </w:rPr>
+        <w:t xml:space="preserve">in one sentence describing where B’s tip ends up. If your initial answer was 7, write a sentence underneath explaining why the correct answer is 5.”</w:t>
       </w:r>
     </w:p>
-    <w:bookmarkEnd w:id="20"/>
-    <w:bookmarkStart w:id="21" w:name="nyssls-observation-checklist-crosswalk"/>
+    <w:p>
+      <w:pPr>
+        <w:pStyle w:val="FirstParagraph"/>
+      </w:pPr>
+      <w:r>
+        <w:t xml:space="preserve">This is the moment where the student’s</w:t>
+      </w:r>
+      <w:r>
+        <w:t xml:space="preserve"> </w:t>
+      </w:r>
+      <w:r>
+        <w:rPr>
+          <w:i/>
+          <w:iCs/>
+        </w:rPr>
+        <w:t xml:space="preserve">own</w:t>
+      </w:r>
+      <w:r>
+        <w:t xml:space="preserve"> </w:t>
+      </w:r>
+      <w:r>
+        <w:t xml:space="preserve">initial misconception (if they had one) gets corrected by their</w:t>
+      </w:r>
+      <w:r>
+        <w:t xml:space="preserve"> </w:t>
+      </w:r>
+      <w:r>
+        <w:rPr>
+          <w:i/>
+          <w:iCs/>
+        </w:rPr>
+        <w:t xml:space="preserve">own</w:t>
+      </w:r>
+      <w:r>
+        <w:t xml:space="preserve"> </w:t>
+      </w:r>
+      <w:r>
+        <w:t xml:space="preserve">hand. The Hochman</w:t>
+      </w:r>
+      <w:r>
+        <w:t xml:space="preserve"> </w:t>
+      </w:r>
+      <w:r>
+        <w:rPr>
+          <w:i/>
+          <w:iCs/>
+        </w:rPr>
+        <w:t xml:space="preserve">because/but/so</w:t>
+      </w:r>
+      <w:r>
+        <w:t xml:space="preserve"> </w:t>
+      </w:r>
+      <w:r>
+        <w:t xml:space="preserve">move can scaffold the correction:</w:t>
+      </w:r>
+    </w:p>
+    <w:p>
+      <w:pPr>
+        <w:pStyle w:val="BlockText"/>
+      </w:pPr>
+      <w:r>
+        <w:t xml:space="preserve">“I first wrote 4 + 3 = 7</w:t>
+      </w:r>
+      <w:r>
+        <w:t xml:space="preserve"> </w:t>
+      </w:r>
+      <w:r>
+        <w:rPr>
+          <w:i/>
+          <w:iCs/>
+        </w:rPr>
+        <w:t xml:space="preserve">because</w:t>
+      </w:r>
+      <w:r>
+        <w:t xml:space="preserve"> </w:t>
+      </w:r>
+      <w:r>
+        <w:t xml:space="preserve">I added the magnitudes,</w:t>
+      </w:r>
+      <w:r>
+        <w:t xml:space="preserve"> </w:t>
+      </w:r>
+      <w:r>
+        <w:rPr>
+          <w:i/>
+          <w:iCs/>
+        </w:rPr>
+        <w:t xml:space="preserve">but</w:t>
+      </w:r>
+      <w:r>
+        <w:t xml:space="preserve"> </w:t>
+      </w:r>
+      <w:r>
+        <w:t xml:space="preserve">the arrows are perpendicular,</w:t>
+      </w:r>
+      <w:r>
+        <w:t xml:space="preserve"> </w:t>
+      </w:r>
+      <w:r>
+        <w:rPr>
+          <w:i/>
+          <w:iCs/>
+        </w:rPr>
+        <w:t xml:space="preserve">so</w:t>
+      </w:r>
+      <w:r>
+        <w:t xml:space="preserve"> </w:t>
+      </w:r>
+      <w:r>
+        <w:t xml:space="preserve">the resultant uses Pythagoras: √(16+9) = 5.”</w:t>
+      </w:r>
+    </w:p>
+    <w:bookmarkEnd w:id="34"/>
+    <w:bookmarkStart w:id="35" w:name="min-return-to-the-phenomenon"/>
+    <w:p>
+      <w:pPr>
+        <w:pStyle w:val="Heading3"/>
+      </w:pPr>
+      <w:r>
+        <w:t xml:space="preserve">39–40 min · Return to the phenomenon</w:t>
+      </w:r>
+    </w:p>
+    <w:p>
+      <w:pPr>
+        <w:pStyle w:val="FirstParagraph"/>
+      </w:pPr>
+      <w:r>
+        <w:t xml:space="preserve">Re-show the original Physics Classroom vector animation. Ask the class:</w:t>
+      </w:r>
+    </w:p>
+    <w:p>
+      <w:pPr>
+        <w:pStyle w:val="BlockText"/>
+      </w:pPr>
+      <w:r>
+        <w:t xml:space="preserve">“Now that we’ve worked this out, what would you say to a friend who watched this animation and said</w:t>
+      </w:r>
+      <w:r>
+        <w:t xml:space="preserve"> </w:t>
+      </w:r>
+      <w:r>
+        <w:t xml:space="preserve">‘I don’t get it’</w:t>
+      </w:r>
+      <w:r>
+        <w:t xml:space="preserve">?”</w:t>
+      </w:r>
+    </w:p>
+    <w:p>
+      <w:pPr>
+        <w:pStyle w:val="FirstParagraph"/>
+      </w:pPr>
+      <w:r>
+        <w:t xml:space="preserve">Take one volunteer’s response. The target response uses</w:t>
+      </w:r>
+      <w:r>
+        <w:t xml:space="preserve"> </w:t>
+      </w:r>
+      <w:r>
+        <w:rPr>
+          <w:b/>
+          <w:bCs/>
+        </w:rPr>
+        <w:t xml:space="preserve">vector</w:t>
+      </w:r>
+      <w:r>
+        <w:t xml:space="preserve">,</w:t>
+      </w:r>
+      <w:r>
+        <w:t xml:space="preserve"> </w:t>
+      </w:r>
+      <w:r>
+        <w:rPr>
+          <w:b/>
+          <w:bCs/>
+        </w:rPr>
+        <w:t xml:space="preserve">magnitude</w:t>
+      </w:r>
+      <w:r>
+        <w:t xml:space="preserve">,</w:t>
+      </w:r>
+      <w:r>
+        <w:t xml:space="preserve"> </w:t>
+      </w:r>
+      <w:r>
+        <w:rPr>
+          <w:b/>
+          <w:bCs/>
+        </w:rPr>
+        <w:t xml:space="preserve">direction</w:t>
+      </w:r>
+      <w:r>
+        <w:t xml:space="preserve"> </w:t>
+      </w:r>
+      <w:r>
+        <w:t xml:space="preserve">in a single sentence — and that’s the lesson’s success criterion in action.</w:t>
+      </w:r>
+    </w:p>
+    <w:p>
+      <w:r>
+        <w:pict>
+          <v:rect style="width:0;height:1.5pt" o:hralign="center" o:hrstd="t" o:hr="t"/>
+        </w:pict>
+      </w:r>
+    </w:p>
+    <w:bookmarkEnd w:id="35"/>
+    <w:bookmarkEnd w:id="36"/>
+    <w:bookmarkStart w:id="38" w:name="phase-5-evaluate-40-42-min"/>
+    <w:p>
+      <w:pPr>
+        <w:pStyle w:val="Heading2"/>
+      </w:pPr>
+      <w:r>
+        <w:t xml:space="preserve">Phase 5 · Evaluate</w:t>
+      </w:r>
+      <w:r>
+        <w:t xml:space="preserve"> </w:t>
+      </w:r>
+      <w:r>
+        <w:rPr>
+          <w:i/>
+          <w:iCs/>
+        </w:rPr>
+        <w:t xml:space="preserve">(40 – 42 min)</w:t>
+      </w:r>
+    </w:p>
+    <w:p>
+      <w:pPr>
+        <w:pStyle w:val="FirstParagraph"/>
+      </w:pPr>
+      <w:r>
+        <w:rPr>
+          <w:b/>
+          <w:bCs/>
+        </w:rPr>
+        <w:t xml:space="preserve">Transfer task assessment.</w:t>
+      </w:r>
+      <w:r>
+        <w:t xml:space="preserve"> </w:t>
+      </w:r>
+      <w:r>
+        <w:t xml:space="preserve">A new phenomenon (different from the lesson’s hook) for students to apply their learning. Per the NYSSLS observation checklist (item 8), this is the in-lesson assessment.</w:t>
+      </w:r>
+    </w:p>
+    <w:bookmarkStart w:id="37" w:name="min-exit-ticket-closing-reflection"/>
+    <w:p>
+      <w:pPr>
+        <w:pStyle w:val="Heading3"/>
+      </w:pPr>
+      <w:r>
+        <w:t xml:space="preserve">40–42 min · Exit Ticket + Closing Reflection</w:t>
+      </w:r>
+    </w:p>
+    <w:p>
+      <w:pPr>
+        <w:pStyle w:val="FirstParagraph"/>
+      </w:pPr>
+      <w:r>
+        <w:t xml:space="preserve">Distribute exit slips. The transfer prompt:</w:t>
+      </w:r>
+    </w:p>
+    <w:p>
+      <w:pPr>
+        <w:pStyle w:val="BlockText"/>
+      </w:pPr>
+      <w:r>
+        <w:rPr>
+          <w:i/>
+          <w:iCs/>
+        </w:rPr>
+        <w:t xml:space="preserve">“A boat sails 5 km east, then 12 km north. Sketch the resultant displacement on a grid and find its magnitude. Show one sentence of reasoning.”</w:t>
+      </w:r>
+    </w:p>
+    <w:p>
+      <w:pPr>
+        <w:pStyle w:val="FirstParagraph"/>
+      </w:pPr>
+      <w:r>
+        <w:t xml:space="preserve">Expected: 13 km, with reasoning that references the Pythagorean theorem or head-to-tail rule. See</w:t>
+      </w:r>
+      <w:r>
+        <w:t xml:space="preserve"> </w:t>
+      </w:r>
+      <w:r>
+        <w:rPr>
+          <w:rStyle w:val="VerbatimChar"/>
+        </w:rPr>
+        <w:t xml:space="preserve">Answer_Key.docx</w:t>
+      </w:r>
+      <w:r>
+        <w:t xml:space="preserve"> </w:t>
+      </w:r>
+      <w:r>
+        <w:t xml:space="preserve">for the rubric and tolerance.</w:t>
+      </w:r>
+    </w:p>
+    <w:p>
+      <w:pPr>
+        <w:pStyle w:val="BodyText"/>
+      </w:pPr>
+      <w:r>
+        <w:rPr>
+          <w:b/>
+          <w:bCs/>
+        </w:rPr>
+        <w:t xml:space="preserve">Closing Reflection (SEL, 30 seconds, on the same exit slip):</w:t>
+      </w:r>
+    </w:p>
+    <w:p>
+      <w:pPr>
+        <w:pStyle w:val="BlockText"/>
+      </w:pPr>
+      <w:r>
+        <w:t xml:space="preserve">“What is one thing that surprised you today? Who helped you make sense of something?”</w:t>
+      </w:r>
+    </w:p>
+    <w:p>
+      <w:r>
+        <w:pict>
+          <v:rect style="width:0;height:1.5pt" o:hralign="center" o:hrstd="t" o:hr="t"/>
+        </w:pict>
+      </w:r>
+    </w:p>
+    <w:bookmarkEnd w:id="37"/>
+    <w:bookmarkEnd w:id="38"/>
+    <w:bookmarkStart w:id="39" w:name="common-misconceptions"/>
+    <w:p>
+      <w:pPr>
+        <w:pStyle w:val="Heading2"/>
+      </w:pPr>
+      <w:r>
+        <w:t xml:space="preserve">Common Misconceptions</w:t>
+      </w:r>
+    </w:p>
+    <w:p>
+      <w:pPr>
+        <w:pStyle w:val="Compact"/>
+        <w:numPr>
+          <w:ilvl w:val="0"/>
+          <w:numId w:val="1011"/>
+        </w:numPr>
+      </w:pPr>
+      <w:r>
+        <w:rPr>
+          <w:b/>
+          <w:bCs/>
+        </w:rPr>
+        <w:t xml:space="preserve">Misconception:</w:t>
+      </w:r>
+      <w:r>
+        <w:t xml:space="preserve"> </w:t>
+      </w:r>
+      <w:r>
+        <w:t xml:space="preserve">“Vectors with bigger numbers are always longer.”</w:t>
+      </w:r>
+      <w:r>
+        <w:t xml:space="preserve"> </w:t>
+      </w:r>
+      <w:r>
+        <w:t xml:space="preserve">→</w:t>
+      </w:r>
+      <w:r>
+        <w:t xml:space="preserve"> </w:t>
+      </w:r>
+      <w:r>
+        <w:rPr>
+          <w:b/>
+          <w:bCs/>
+        </w:rPr>
+        <w:t xml:space="preserve">Correction:</w:t>
+      </w:r>
+      <w:r>
+        <w:t xml:space="preserve"> </w:t>
+      </w:r>
+      <w:r>
+        <w:t xml:space="preserve">Two vectors of equal magnitude but different directions add to</w:t>
+      </w:r>
+      <w:r>
+        <w:t xml:space="preserve"> </w:t>
+      </w:r>
+      <w:r>
+        <w:rPr>
+          <w:i/>
+          <w:iCs/>
+        </w:rPr>
+        <w:t xml:space="preserve">different</w:t>
+      </w:r>
+      <w:r>
+        <w:t xml:space="preserve"> </w:t>
+      </w:r>
+      <w:r>
+        <w:t xml:space="preserve">resultants — direction matters as much as magnitude.</w:t>
+      </w:r>
+    </w:p>
+    <w:p>
+      <w:pPr>
+        <w:pStyle w:val="Compact"/>
+        <w:numPr>
+          <w:ilvl w:val="0"/>
+          <w:numId w:val="1011"/>
+        </w:numPr>
+      </w:pPr>
+      <w:r>
+        <w:rPr>
+          <w:b/>
+          <w:bCs/>
+        </w:rPr>
+        <w:t xml:space="preserve">Misconception:</w:t>
+      </w:r>
+      <w:r>
+        <w:t xml:space="preserve"> </w:t>
+      </w:r>
+      <w:r>
+        <w:t xml:space="preserve">“Adding vectors is the same as adding their magnitudes.”</w:t>
+      </w:r>
+      <w:r>
+        <w:t xml:space="preserve"> </w:t>
+      </w:r>
+      <w:r>
+        <w:t xml:space="preserve">→</w:t>
+      </w:r>
+      <w:r>
+        <w:t xml:space="preserve"> </w:t>
+      </w:r>
+      <w:r>
+        <w:rPr>
+          <w:b/>
+          <w:bCs/>
+        </w:rPr>
+        <w:t xml:space="preserve">Correction:</w:t>
+      </w:r>
+      <w:r>
+        <w:t xml:space="preserve"> </w:t>
+      </w:r>
+      <w:r>
+        <w:t xml:space="preserve">That is only true when they point in exactly the same direction. In every other case the resultant magnitude is</w:t>
+      </w:r>
+      <w:r>
+        <w:t xml:space="preserve"> </w:t>
+      </w:r>
+      <w:r>
+        <w:rPr>
+          <w:i/>
+          <w:iCs/>
+        </w:rPr>
+        <w:t xml:space="preserve">less</w:t>
+      </w:r>
+      <w:r>
+        <w:t xml:space="preserve"> </w:t>
+      </w:r>
+      <w:r>
+        <w:t xml:space="preserve">than the sum (and equals zero when they cancel).</w:t>
+      </w:r>
+    </w:p>
+    <w:p>
+      <w:pPr>
+        <w:pStyle w:val="Compact"/>
+        <w:numPr>
+          <w:ilvl w:val="0"/>
+          <w:numId w:val="1011"/>
+        </w:numPr>
+      </w:pPr>
+      <w:r>
+        <w:rPr>
+          <w:b/>
+          <w:bCs/>
+        </w:rPr>
+        <w:t xml:space="preserve">Misconception:</w:t>
+      </w:r>
+      <w:r>
+        <w:t xml:space="preserve"> </w:t>
+      </w:r>
+      <w:r>
+        <w:t xml:space="preserve">“The resultant is always longer than each input vector.”</w:t>
+      </w:r>
+      <w:r>
+        <w:t xml:space="preserve"> </w:t>
+      </w:r>
+      <w:r>
+        <w:t xml:space="preserve">→</w:t>
+      </w:r>
+      <w:r>
+        <w:t xml:space="preserve"> </w:t>
+      </w:r>
+      <w:r>
+        <w:rPr>
+          <w:b/>
+          <w:bCs/>
+        </w:rPr>
+        <w:t xml:space="preserve">Correction:</w:t>
+      </w:r>
+      <w:r>
+        <w:t xml:space="preserve"> </w:t>
+      </w:r>
+      <w:r>
+        <w:t xml:space="preserve">Not when the vectors point opposite directions. The resultant can be shorter than either input, or even zero.</w:t>
+      </w:r>
+    </w:p>
+    <w:p>
+      <w:r>
+        <w:pict>
+          <v:rect style="width:0;height:1.5pt" o:hralign="center" o:hrstd="t" o:hr="t"/>
+        </w:pict>
+      </w:r>
+    </w:p>
+    <w:bookmarkEnd w:id="39"/>
+    <w:bookmarkStart w:id="40" w:name="access-differentiation"/>
+    <w:p>
+      <w:pPr>
+        <w:pStyle w:val="Heading2"/>
+      </w:pPr>
+      <w:r>
+        <w:t xml:space="preserve">Access &amp; Differentiation</w:t>
+      </w:r>
+    </w:p>
+    <w:p>
+      <w:pPr>
+        <w:pStyle w:val="Compact"/>
+        <w:numPr>
+          <w:ilvl w:val="0"/>
+          <w:numId w:val="1012"/>
+        </w:numPr>
+      </w:pPr>
+      <w:r>
+        <w:rPr>
+          <w:b/>
+          <w:bCs/>
+        </w:rPr>
+        <w:t xml:space="preserve">ELL/ENL supports:</w:t>
+      </w:r>
+      <w:r>
+        <w:t xml:space="preserve"> </w:t>
+      </w:r>
+      <w:r>
+        <w:t xml:space="preserve">Sentence frames — *“The resultant of A + B has magnitude ___ because ___.”* and *“Adding A and B gives a resultant that points ___.”* Word-choice box: {magnitude, direction, resultant, components, scalar}. Visual-first framing — show two arrows on a grid before introducing the word</w:t>
+      </w:r>
+      <w:r>
+        <w:t xml:space="preserve"> </w:t>
+      </w:r>
+      <w:r>
+        <w:rPr>
+          <w:i/>
+          <w:iCs/>
+        </w:rPr>
+        <w:t xml:space="preserve">vector</w:t>
+      </w:r>
+      <w:r>
+        <w:t xml:space="preserve">. Bilingual glossary slot in student notebook for the three vocabulary words.</w:t>
+      </w:r>
+    </w:p>
+    <w:p>
+      <w:pPr>
+        <w:pStyle w:val="Compact"/>
+        <w:numPr>
+          <w:ilvl w:val="0"/>
+          <w:numId w:val="1012"/>
+        </w:numPr>
+      </w:pPr>
+      <w:r>
+        <w:rPr>
+          <w:b/>
+          <w:bCs/>
+        </w:rPr>
+        <w:t xml:space="preserve">IEP/SPED supports:</w:t>
+      </w:r>
+      <w:r>
+        <w:t xml:space="preserve"> </w:t>
+      </w:r>
+      <w:r>
+        <w:t xml:space="preserve">Use the printed Vector Golf course as a chunked, scaffolded organizer; pre-draw the first arrow for each problem so students start from the head of an existing arrow. Provide a step list: (1) draw A from origin, (2) draw B from head of A, (3) draw R from origin to head of B. Allow oral responses for the exit ticket.</w:t>
+      </w:r>
+    </w:p>
+    <w:p>
+      <w:pPr>
+        <w:pStyle w:val="Compact"/>
+        <w:numPr>
+          <w:ilvl w:val="0"/>
+          <w:numId w:val="1012"/>
+        </w:numPr>
+      </w:pPr>
+      <w:r>
+        <w:rPr>
+          <w:b/>
+          <w:bCs/>
+        </w:rPr>
+        <w:t xml:space="preserve">Extensions:</w:t>
+      </w:r>
+      <w:r>
+        <w:t xml:space="preserve"> </w:t>
+      </w:r>
+      <w:r>
+        <w:t xml:space="preserve">After Vector Golf, prompt advanced students to find the</w:t>
+      </w:r>
+      <w:r>
+        <w:t xml:space="preserve"> </w:t>
+      </w:r>
+      <w:r>
+        <w:rPr>
+          <w:i/>
+          <w:iCs/>
+        </w:rPr>
+        <w:t xml:space="preserve">minimum</w:t>
+      </w:r>
+      <w:r>
+        <w:t xml:space="preserve"> </w:t>
+      </w:r>
+      <w:r>
+        <w:t xml:space="preserve">number of vector additions to reach the target — introduces optimization thinking and previews path-planning intuition. Or: ask them to invent a 3-vector course where the resultant is exactly zero.</w:t>
+      </w:r>
+    </w:p>
+    <w:p>
+      <w:r>
+        <w:pict>
+          <v:rect style="width:0;height:1.5pt" o:hralign="center" o:hrstd="t" o:hr="t"/>
+        </w:pict>
+      </w:r>
+    </w:p>
+    <w:bookmarkEnd w:id="40"/>
+    <w:bookmarkStart w:id="41" w:name="strategy-spotlight"/>
+    <w:p>
+      <w:pPr>
+        <w:pStyle w:val="Heading2"/>
+      </w:pPr>
+      <w:r>
+        <w:t xml:space="preserve">Strategy Spotlight</w:t>
+      </w:r>
+    </w:p>
+    <w:p>
+      <w:pPr>
+        <w:pStyle w:val="FirstParagraph"/>
+      </w:pPr>
+      <w:r>
+        <w:rPr>
+          <w:b/>
+          <w:bCs/>
+        </w:rPr>
+        <w:t xml:space="preserve">Restorative Circle (unit opener, 2 min)</w:t>
+      </w:r>
+      <w:r>
+        <w:t xml:space="preserve"> </w:t>
+      </w:r>
+      <w:r>
+        <w:t xml:space="preserve">— see Phase 1, Opening Connection. The full process is described above with sample teacher language and anticipated responses. Keep the circle short — under 3 minutes — and resist responding to individual answers.</w:t>
+      </w:r>
+    </w:p>
+    <w:p>
+      <w:pPr>
+        <w:pStyle w:val="BodyText"/>
+      </w:pPr>
+      <w:r>
+        <w:rPr>
+          <w:b/>
+          <w:bCs/>
+        </w:rPr>
+        <w:t xml:space="preserve">Active Learning — Vector Golf stations (15 min)</w:t>
+      </w:r>
+      <w:r>
+        <w:t xml:space="preserve"> </w:t>
+      </w:r>
+      <w:r>
+        <w:t xml:space="preserve">— see Phase 2, Investigation. The full station setup, group-formation method, rotation cadence, and teacher facilitation language are described above. The key teacher move is</w:t>
+      </w:r>
+      <w:r>
+        <w:t xml:space="preserve"> </w:t>
+      </w:r>
+      <w:r>
+        <w:rPr>
+          <w:i/>
+          <w:iCs/>
+        </w:rPr>
+        <w:t xml:space="preserve">resisting solving</w:t>
+      </w:r>
+      <w:r>
+        <w:t xml:space="preserve"> </w:t>
+      </w:r>
+      <w:r>
+        <w:t xml:space="preserve">— the strategy depends on students arguing with each other at the chart paper.</w:t>
+      </w:r>
+    </w:p>
+    <w:p>
+      <w:r>
+        <w:pict>
+          <v:rect style="width:0;height:1.5pt" o:hralign="center" o:hrstd="t" o:hr="t"/>
+        </w:pict>
+      </w:r>
+    </w:p>
+    <w:bookmarkEnd w:id="41"/>
+    <w:bookmarkStart w:id="42" w:name="nyssls-observation-checklist-crosswalk"/>
     <w:p>
       <w:pPr>
         <w:pStyle w:val="Heading2"/>
@@ -388,7 +2846,7 @@
               <w:pStyle w:val="Compact"/>
             </w:pPr>
             <w:r>
-              <w:t xml:space="preserve">Item</w:t>
+              <w:t xml:space="preserve">Checklist item</w:t>
             </w:r>
           </w:p>
         </w:tc>
@@ -399,7 +2857,7 @@
               <w:pStyle w:val="Compact"/>
             </w:pPr>
             <w:r>
-              <w:t xml:space="preserve">Where it shows up in this lesson</w:t>
+              <w:t xml:space="preserve">Where it appears in this lesson</w:t>
             </w:r>
           </w:p>
         </w:tc>
@@ -434,7 +2892,7 @@
               <w:pStyle w:val="Compact"/>
             </w:pPr>
             <w:r>
-              <w:t xml:space="preserve">Phenomenon section — Physics Classroom vector animation; teacher may substitute a Long Island sailing or driving example</w:t>
+              <w:t xml:space="preserve">Phase 1 — Phenomenon hook (Physics Classroom vector animation)</w:t>
             </w:r>
           </w:p>
         </w:tc>
@@ -469,7 +2927,7 @@
               <w:pStyle w:val="Compact"/>
             </w:pPr>
             <w:r>
-              <w:t xml:space="preserve">TT#1 after Notice &amp; Wonder; TT#2 after the interactive; optional silence-breaker prompt during Vector Golf stations</w:t>
+              <w:t xml:space="preserve">Phase 1 (TT#1 after Notice &amp; Wonder), Phase 3 (TT#2 on the 3,4,5 triangle)</w:t>
             </w:r>
           </w:p>
         </w:tc>
@@ -504,7 +2962,7 @@
               <w:pStyle w:val="Compact"/>
             </w:pPr>
             <w:r>
-              <w:t xml:space="preserve">Initial Model block; Vector Golf stations; Revise Your Model block</w:t>
+              <w:t xml:space="preserve">Phase 1 (initial model), Phase 2 (Vector Golf station strategies), Phase 4 (revise model)</w:t>
             </w:r>
           </w:p>
         </w:tc>
@@ -539,10 +2997,7 @@
               <w:pStyle w:val="Compact"/>
             </w:pPr>
             <w:r>
-              <w:t xml:space="preserve">CCC Focus restated when launching the interactive (</w:t>
-            </w:r>
-            <w:r>
-              <w:t xml:space="preserve">“we’re watching for</w:t>
+              <w:t xml:space="preserve">Lesson Overview ·</w:t>
             </w:r>
             <w:r>
               <w:t xml:space="preserve"> </w:t>
@@ -552,16 +3007,10 @@
                 <w:i/>
                 <w:iCs/>
               </w:rPr>
-              <w:t xml:space="preserve">cause and effect</w:t>
+              <w:t xml:space="preserve">Cause and Effect</w:t>
             </w:r>
             <w:r>
-              <w:t xml:space="preserve"> </w:t>
-            </w:r>
-            <w:r>
-              <w:t xml:space="preserve">— how direction changes the result”</w:t>
-            </w:r>
-            <w:r>
-              <w:t xml:space="preserve">)</w:t>
+              <w:t xml:space="preserve">, restated mid-Phase 2</w:t>
             </w:r>
           </w:p>
         </w:tc>
@@ -585,7 +3034,7 @@
               <w:pStyle w:val="Compact"/>
             </w:pPr>
             <w:r>
-              <w:t xml:space="preserve">ENL — ≤3 vocab, second half</w:t>
+              <w:t xml:space="preserve">ENL — ≤ 3 vocab, second half</w:t>
             </w:r>
           </w:p>
         </w:tc>
@@ -596,7 +3045,7 @@
               <w:pStyle w:val="Compact"/>
             </w:pPr>
             <w:r>
-              <w:t xml:space="preserve">Key Vocabulary box appears after the investigation, second half of the lesson</w:t>
+              <w:t xml:space="preserve">Phase 3 — Vocabulary introduction at 35–37 min (vector / magnitude / direction)</w:t>
             </w:r>
           </w:p>
         </w:tc>
@@ -631,7 +3080,7 @@
               <w:pStyle w:val="Compact"/>
             </w:pPr>
             <w:r>
-              <w:t xml:space="preserve">Return to the Phenomenon section asks students to re-predict the original animation using today’s vocabulary</w:t>
+              <w:t xml:space="preserve">Phase 4 — Return to the phenomenon at 39–40 min</w:t>
             </w:r>
           </w:p>
         </w:tc>
@@ -666,7 +3115,7 @@
               <w:pStyle w:val="Compact"/>
             </w:pPr>
             <w:r>
-              <w:t xml:space="preserve">Access &amp; Differentiation section — sentence frames, word-choice box, pre-drawn first arrow on Vector Golf scaffolds</w:t>
+              <w:t xml:space="preserve">Access &amp; Differentiation block (sentence frames, pre-drawn arrows, oral exit-ticket option)</w:t>
             </w:r>
           </w:p>
         </w:tc>
@@ -701,101 +3150,153 @@
               <w:pStyle w:val="Compact"/>
             </w:pPr>
             <w:r>
-              <w:t xml:space="preserve">Exit Ticket: boat 5 km east, 12 km north — find resultant magnitude and direction</w:t>
+              <w:t xml:space="preserve">Phase 5 — Exit Ticket (boat 5 km E + 12 km N) + Closing Reflection</w:t>
             </w:r>
           </w:p>
         </w:tc>
       </w:tr>
     </w:tbl>
-    <w:bookmarkEnd w:id="21"/>
-    <w:bookmarkStart w:id="22" w:name="opening-connection"/>
     <w:p>
+      <w:r>
+        <w:pict>
+          <v:rect style="width:0;height:1.5pt" o:hralign="center" o:hrstd="t" o:hr="t"/>
+        </w:pict>
+      </w:r>
+    </w:p>
+    <w:bookmarkEnd w:id="42"/>
+    <w:bookmarkStart w:id="43" w:name="companion-materials"/>
+    <w:p>
       <w:pPr>
         <w:pStyle w:val="Heading2"/>
       </w:pPr>
       <w:r>
-        <w:t xml:space="preserve">Opening Connection</w:t>
+        <w:t xml:space="preserve">Companion Materials</w:t>
       </w:r>
     </w:p>
     <w:p>
       <w:pPr>
-        <w:pStyle w:val="FirstParagraph"/>
-      </w:pPr>
-      <w:r>
-        <w:t xml:space="preserve">Pick one (SEL):</w:t>
+        <w:pStyle w:val="Compact"/>
+        <w:numPr>
+          <w:ilvl w:val="0"/>
+          <w:numId w:val="1013"/>
+        </w:numPr>
+      </w:pPr>
+      <w:r>
+        <w:rPr>
+          <w:rStyle w:val="VerbatimChar"/>
+        </w:rPr>
+        <w:t xml:space="preserve">Student_Exploration.html</w:t>
       </w:r>
       <w:r>
         <w:t xml:space="preserve"> </w:t>
       </w:r>
       <w:r>
-        <w:t xml:space="preserve">- 1-question check-in (e.g.,</w:t>
-      </w:r>
-      <w:r>
-        <w:t xml:space="preserve"> </w:t>
-      </w:r>
-      <w:r>
-        <w:t xml:space="preserve">“On a scale of 1–5, how’s your week going?”</w:t>
-      </w:r>
-      <w:r>
-        <w:t xml:space="preserve">)</w:t>
-      </w:r>
-      <w:r>
-        <w:t xml:space="preserve"> </w:t>
-      </w:r>
-      <w:r>
-        <w:t xml:space="preserve">-</w:t>
-      </w:r>
-      <w:r>
-        <w:t xml:space="preserve"> </w:t>
-      </w:r>
-      <w:r>
-        <w:t xml:space="preserve">“Name something you noticed since last class”</w:t>
-      </w:r>
-      <w:r>
-        <w:t xml:space="preserve"> </w:t>
-      </w:r>
-      <w:r>
-        <w:t xml:space="preserve">- Quick gratitude / effort acknowledgment</w:t>
+        <w:t xml:space="preserve">(rich interactive) — hand to students at start of Phase 2</w:t>
       </w:r>
     </w:p>
     <w:p>
       <w:pPr>
-        <w:pStyle w:val="BodyText"/>
+        <w:pStyle w:val="Compact"/>
+        <w:numPr>
+          <w:ilvl w:val="0"/>
+          <w:numId w:val="1013"/>
+        </w:numPr>
+      </w:pPr>
+      <w:r>
+        <w:rPr>
+          <w:rStyle w:val="VerbatimChar"/>
+        </w:rPr>
+        <w:t xml:space="preserve">Student_Exploration.onenote.html</w:t>
+      </w:r>
+      <w:r>
+        <w:t xml:space="preserve"> </w:t>
+      </w:r>
+      <w:r>
+        <w:t xml:space="preserve">(OneNote-paste static) — for distribution via Class Notebook</w:t>
+      </w:r>
+    </w:p>
+    <w:p>
+      <w:pPr>
+        <w:pStyle w:val="Compact"/>
+        <w:numPr>
+          <w:ilvl w:val="0"/>
+          <w:numId w:val="1013"/>
+        </w:numPr>
+      </w:pPr>
+      <w:r>
+        <w:rPr>
+          <w:rStyle w:val="VerbatimChar"/>
+        </w:rPr>
+        <w:t xml:space="preserve">Answer_Key.docx</w:t>
+      </w:r>
+      <w:r>
+        <w:t xml:space="preserve"> </w:t>
+      </w:r>
+      <w:r>
+        <w:t xml:space="preserve">— answers to</w:t>
+      </w:r>
+      <w:r>
+        <w:t xml:space="preserve"> </w:t>
+      </w:r>
+      <w:r>
+        <w:t xml:space="preserve">“Make It Make Sense”</w:t>
+      </w:r>
+      <w:r>
+        <w:t xml:space="preserve"> </w:t>
+      </w:r>
+      <w:r>
+        <w:t xml:space="preserve">prompts and the Exit Ticket</w:t>
+      </w:r>
+    </w:p>
+    <w:p>
+      <w:pPr>
+        <w:pStyle w:val="Compact"/>
+        <w:numPr>
+          <w:ilvl w:val="0"/>
+          <w:numId w:val="1013"/>
+        </w:numPr>
+      </w:pPr>
+      <w:r>
+        <w:t xml:space="preserve">Web edition (live): https://angsta-ed.github.io/physics-kinematics/lessons/01-vectors.html</w:t>
+      </w:r>
+    </w:p>
+    <w:p>
+      <w:r>
+        <w:pict>
+          <v:rect style="width:0;height:1.5pt" o:hralign="center" o:hrstd="t" o:hr="t"/>
+        </w:pict>
+      </w:r>
+    </w:p>
+    <w:bookmarkEnd w:id="43"/>
+    <w:bookmarkStart w:id="44" w:name="key-vocabulary-max-3"/>
+    <w:p>
+      <w:pPr>
+        <w:pStyle w:val="Heading2"/>
+      </w:pPr>
+      <w:r>
+        <w:t xml:space="preserve">Key Vocabulary (max 3)</w:t>
+      </w:r>
+    </w:p>
+    <w:p>
+      <w:pPr>
+        <w:pStyle w:val="Compact"/>
+        <w:numPr>
+          <w:ilvl w:val="0"/>
+          <w:numId w:val="1014"/>
+        </w:numPr>
       </w:pPr>
       <w:r>
         <w:rPr>
           <w:b/>
           <w:bCs/>
         </w:rPr>
-        <w:t xml:space="preserve">Restorative Circle (unit opener) — 2 min.</w:t>
+        <w:t xml:space="preserve">vector</w:t>
       </w:r>
       <w:r>
         <w:t xml:space="preserve"> </w:t>
       </w:r>
       <w:r>
-        <w:t xml:space="preserve">Pass a small object (a ball, a marker — anything that travels by hand). Each student answers:</w:t>
-      </w:r>
-      <w:r>
-        <w:t xml:space="preserve"> </w:t>
-      </w:r>
-      <w:r>
-        <w:t xml:space="preserve">“What is one experience you’ve had with motion this week?”</w:t>
-      </w:r>
-      <w:r>
-        <w:t xml:space="preserve"> </w:t>
-      </w:r>
-      <w:r>
-        <w:t xml:space="preserve">Honor pass-rights; no follow-up questions.</w:t>
-      </w:r>
-    </w:p>
-    <w:bookmarkEnd w:id="22"/>
-    <w:bookmarkStart w:id="23" w:name="at-a-glance"/>
-    <w:p>
-      <w:pPr>
-        <w:pStyle w:val="Heading2"/>
-      </w:pPr>
-      <w:r>
-        <w:t xml:space="preserve">At-a-Glance</w:t>
+        <w:t xml:space="preserve">— a quantity with both magnitude and direction</w:t>
       </w:r>
     </w:p>
     <w:p>
@@ -803,136 +3304,9 @@
         <w:pStyle w:val="Compact"/>
         <w:numPr>
           <w:ilvl w:val="0"/>
-          <w:numId w:val="1003"/>
+          <w:numId w:val="1014"/>
         </w:numPr>
       </w:pPr>
-      <w:r>
-        <w:rPr>
-          <w:b/>
-          <w:bCs/>
-        </w:rPr>
-        <w:t xml:space="preserve">Duration:</w:t>
-      </w:r>
-      <w:r>
-        <w:t xml:space="preserve"> </w:t>
-      </w:r>
-      <w:r>
-        <w:t xml:space="preserve">42 minutes (1 period)</w:t>
-      </w:r>
-    </w:p>
-    <w:p>
-      <w:pPr>
-        <w:pStyle w:val="Compact"/>
-        <w:numPr>
-          <w:ilvl w:val="0"/>
-          <w:numId w:val="1003"/>
-        </w:numPr>
-      </w:pPr>
-      <w:r>
-        <w:rPr>
-          <w:b/>
-          <w:bCs/>
-        </w:rPr>
-        <w:t xml:space="preserve">Materials:</w:t>
-      </w:r>
-      <w:r>
-        <w:t xml:space="preserve"> </w:t>
-      </w:r>
-      <w:r>
-        <w:t xml:space="preserve">Graph paper or vector grids (1 per student); rulers (1 per pair); printed copies of the Vector Golf course (4 stations × 1 copy each); chart paper for VNPS-style station work; colored markers (purple + blue per group, mirroring the brand palette); the slider-based interactive on each device or projected.</w:t>
-      </w:r>
-    </w:p>
-    <w:p>
-      <w:pPr>
-        <w:pStyle w:val="Compact"/>
-        <w:numPr>
-          <w:ilvl w:val="0"/>
-          <w:numId w:val="1003"/>
-        </w:numPr>
-      </w:pPr>
-      <w:r>
-        <w:rPr>
-          <w:b/>
-          <w:bCs/>
-        </w:rPr>
-        <w:t xml:space="preserve">Safety:</w:t>
-      </w:r>
-      <w:r>
-        <w:t xml:space="preserve"> </w:t>
-      </w:r>
-      <w:r>
-        <w:t xml:space="preserve">None.</w:t>
-      </w:r>
-    </w:p>
-    <w:p>
-      <w:pPr>
-        <w:pStyle w:val="Compact"/>
-        <w:numPr>
-          <w:ilvl w:val="0"/>
-          <w:numId w:val="1003"/>
-        </w:numPr>
-      </w:pPr>
-      <w:r>
-        <w:rPr>
-          <w:b/>
-          <w:bCs/>
-        </w:rPr>
-        <w:t xml:space="preserve">Prior knowledge:</w:t>
-      </w:r>
-      <w:r>
-        <w:t xml:space="preserve"> </w:t>
-      </w:r>
-      <w:r>
-        <w:t xml:space="preserve">Adding signed numbers; reading a coordinate grid; the difference between a measurement (number) and a measurement with direction (e.g.,</w:t>
-      </w:r>
-      <w:r>
-        <w:t xml:space="preserve"> </w:t>
-      </w:r>
-      <w:r>
-        <w:t xml:space="preserve">“30 mph”</w:t>
-      </w:r>
-      <w:r>
-        <w:t xml:space="preserve"> </w:t>
-      </w:r>
-      <w:r>
-        <w:t xml:space="preserve">vs</w:t>
-      </w:r>
-      <w:r>
-        <w:t xml:space="preserve"> </w:t>
-      </w:r>
-      <w:r>
-        <w:t xml:space="preserve">“30 mph north”</w:t>
-      </w:r>
-      <w:r>
-        <w:t xml:space="preserve">).</w:t>
-      </w:r>
-    </w:p>
-    <w:bookmarkEnd w:id="23"/>
-    <w:bookmarkStart w:id="24" w:name="lesson-objectives"/>
-    <w:p>
-      <w:pPr>
-        <w:pStyle w:val="Heading2"/>
-      </w:pPr>
-      <w:r>
-        <w:t xml:space="preserve">Lesson Objectives</w:t>
-      </w:r>
-    </w:p>
-    <w:p>
-      <w:pPr>
-        <w:pStyle w:val="FirstParagraph"/>
-      </w:pPr>
-      <w:r>
-        <w:t xml:space="preserve">I can…</w:t>
-      </w:r>
-      <w:r>
-        <w:t xml:space="preserve"> </w:t>
-      </w:r>
-      <w:r>
-        <w:t xml:space="preserve">- Describe a vector quantity using both</w:t>
-      </w:r>
-      <w:r>
-        <w:t xml:space="preserve"> </w:t>
-      </w:r>
       <w:r>
         <w:rPr>
           <w:b/>
@@ -944,11 +3318,17 @@
         <w:t xml:space="preserve"> </w:t>
       </w:r>
       <w:r>
-        <w:t xml:space="preserve">and</w:t>
-      </w:r>
-      <w:r>
-        <w:t xml:space="preserve"> </w:t>
-      </w:r>
+        <w:t xml:space="preserve">— the size or length of a vector</w:t>
+      </w:r>
+    </w:p>
+    <w:p>
+      <w:pPr>
+        <w:pStyle w:val="Compact"/>
+        <w:numPr>
+          <w:ilvl w:val="0"/>
+          <w:numId w:val="1014"/>
+        </w:numPr>
+      </w:pPr>
       <w:r>
         <w:rPr>
           <w:b/>
@@ -957,1004 +3337,14 @@
         <w:t xml:space="preserve">direction</w:t>
       </w:r>
       <w:r>
-        <w:t xml:space="preserve">.</w:t>
-      </w:r>
-      <w:r>
         <w:t xml:space="preserve"> </w:t>
       </w:r>
       <w:r>
-        <w:t xml:space="preserve">- Add two vectors graphically using the head-to-tail method.</w:t>
-      </w:r>
-      <w:r>
-        <w:t xml:space="preserve"> </w:t>
-      </w:r>
-      <w:r>
-        <w:t xml:space="preserve">- Decompose a vector into its x- and y-components.</w:t>
+        <w:t xml:space="preserve">— the way a vector points, often given as an angle</w:t>
       </w:r>
     </w:p>
-    <w:bookmarkEnd w:id="24"/>
-    <w:bookmarkStart w:id="25" w:name="agenda"/>
-    <w:p>
-      <w:pPr>
-        <w:pStyle w:val="Heading2"/>
-      </w:pPr>
-      <w:r>
-        <w:t xml:space="preserve">Agenda</w:t>
-      </w:r>
-    </w:p>
-    <w:tbl>
-      <w:tblPr>
-        <w:tblStyle w:val="Table"/>
-        <w:tblW w:type="pct" w:w="5000"/>
-        <w:tblLayout w:type="fixed"/>
-        <w:tblLook w:firstRow="1" w:lastRow="0" w:firstColumn="0" w:lastColumn="0" w:noHBand="0" w:noVBand="0" w:val="0020"/>
-      </w:tblPr>
-      <w:tblGrid>
-        <w:gridCol w:w="2640"/>
-        <w:gridCol w:w="2640"/>
-        <w:gridCol w:w="2640"/>
-      </w:tblGrid>
-      <w:tr>
-        <w:trPr>
-          <w:tblHeader w:val="on"/>
-        </w:trPr>
-        <w:tc>
-          <w:tcPr/>
-          <w:p>
-            <w:pPr>
-              <w:pStyle w:val="Compact"/>
-            </w:pPr>
-            <w:r>
-              <w:t xml:space="preserve">Time</w:t>
-            </w:r>
-          </w:p>
-        </w:tc>
-        <w:tc>
-          <w:tcPr/>
-          <w:p>
-            <w:pPr>
-              <w:pStyle w:val="Compact"/>
-            </w:pPr>
-            <w:r>
-              <w:t xml:space="preserve">Block</w:t>
-            </w:r>
-          </w:p>
-        </w:tc>
-        <w:tc>
-          <w:tcPr/>
-          <w:p>
-            <w:pPr>
-              <w:pStyle w:val="Compact"/>
-            </w:pPr>
-            <w:r>
-              <w:t xml:space="preserve">Notes</w:t>
-            </w:r>
-          </w:p>
-        </w:tc>
-      </w:tr>
-      <w:tr>
-        <w:tc>
-          <w:tcPr/>
-          <w:p>
-            <w:pPr>
-              <w:pStyle w:val="Compact"/>
-            </w:pPr>
-            <w:r>
-              <w:t xml:space="preserve">0–3</w:t>
-            </w:r>
-          </w:p>
-        </w:tc>
-        <w:tc>
-          <w:tcPr/>
-          <w:p>
-            <w:pPr>
-              <w:pStyle w:val="Compact"/>
-            </w:pPr>
-            <w:r>
-              <w:t xml:space="preserve">Opening Connection (SEL)</w:t>
-            </w:r>
-          </w:p>
-        </w:tc>
-        <w:tc>
-          <w:tcPr/>
-          <w:p>
-            <w:pPr>
-              <w:pStyle w:val="Compact"/>
-            </w:pPr>
-            <w:r>
-              <w:t xml:space="preserve">Restorative Circle (unit opener); see Strategy Spotlight</w:t>
-            </w:r>
-          </w:p>
-        </w:tc>
-      </w:tr>
-      <w:tr>
-        <w:tc>
-          <w:tcPr/>
-          <w:p>
-            <w:pPr>
-              <w:pStyle w:val="Compact"/>
-            </w:pPr>
-            <w:r>
-              <w:t xml:space="preserve">3–7</w:t>
-            </w:r>
-          </w:p>
-        </w:tc>
-        <w:tc>
-          <w:tcPr/>
-          <w:p>
-            <w:pPr>
-              <w:pStyle w:val="Compact"/>
-            </w:pPr>
-            <w:r>
-              <w:t xml:space="preserve">Phenomenon hook</w:t>
-            </w:r>
-          </w:p>
-        </w:tc>
-        <w:tc>
-          <w:tcPr/>
-          <w:p>
-            <w:pPr>
-              <w:pStyle w:val="Compact"/>
-            </w:pPr>
-            <w:r>
-              <w:t xml:space="preserve">Show the Physics Classroom vector animation; let it loop silently</w:t>
-            </w:r>
-          </w:p>
-        </w:tc>
-      </w:tr>
-      <w:tr>
-        <w:tc>
-          <w:tcPr/>
-          <w:p>
-            <w:pPr>
-              <w:pStyle w:val="Compact"/>
-            </w:pPr>
-            <w:r>
-              <w:t xml:space="preserve">7–12</w:t>
-            </w:r>
-          </w:p>
-        </w:tc>
-        <w:tc>
-          <w:tcPr/>
-          <w:p>
-            <w:pPr>
-              <w:pStyle w:val="Compact"/>
-            </w:pPr>
-            <w:r>
-              <w:t xml:space="preserve">Notice &amp; Wonder + Turn and Talk #1</w:t>
-            </w:r>
-          </w:p>
-        </w:tc>
-        <w:tc>
-          <w:tcPr/>
-          <w:p>
-            <w:pPr>
-              <w:pStyle w:val="Compact"/>
-            </w:pPr>
-            <w:r>
-              <w:t xml:space="preserve">Capture both columns on chart paper or shared doc</w:t>
-            </w:r>
-          </w:p>
-        </w:tc>
-      </w:tr>
-      <w:tr>
-        <w:tc>
-          <w:tcPr/>
-          <w:p>
-            <w:pPr>
-              <w:pStyle w:val="Compact"/>
-            </w:pPr>
-            <w:r>
-              <w:t xml:space="preserve">12–17</w:t>
-            </w:r>
-          </w:p>
-        </w:tc>
-        <w:tc>
-          <w:tcPr/>
-          <w:p>
-            <w:pPr>
-              <w:pStyle w:val="Compact"/>
-            </w:pPr>
-            <w:r>
-              <w:t xml:space="preserve">Initial Model</w:t>
-            </w:r>
-          </w:p>
-        </w:tc>
-        <w:tc>
-          <w:tcPr/>
-          <w:p>
-            <w:pPr>
-              <w:pStyle w:val="Compact"/>
-            </w:pPr>
-            <w:r>
-              <w:t xml:space="preserve">Each student sketches:</w:t>
-            </w:r>
-            <w:r>
-              <w:t xml:space="preserve"> </w:t>
-            </w:r>
-            <w:r>
-              <w:t xml:space="preserve">“How would I tell someone where the second arrow ends?”</w:t>
-            </w:r>
-          </w:p>
-        </w:tc>
-      </w:tr>
-      <w:tr>
-        <w:tc>
-          <w:tcPr/>
-          <w:p>
-            <w:pPr>
-              <w:pStyle w:val="Compact"/>
-            </w:pPr>
-            <w:r>
-              <w:t xml:space="preserve">17–32</w:t>
-            </w:r>
-          </w:p>
-        </w:tc>
-        <w:tc>
-          <w:tcPr/>
-          <w:p>
-            <w:pPr>
-              <w:pStyle w:val="Compact"/>
-            </w:pPr>
-            <w:r>
-              <w:t xml:space="preserve">Investigate — Vector Golf stations</w:t>
-            </w:r>
-          </w:p>
-        </w:tc>
-        <w:tc>
-          <w:tcPr/>
-          <w:p>
-            <w:pPr>
-              <w:pStyle w:val="Compact"/>
-            </w:pPr>
-            <w:r>
-              <w:t xml:space="preserve">4 stations, 3 students each, 3-min rotations; chart paper at standing height (VNPS lite)</w:t>
-            </w:r>
-          </w:p>
-        </w:tc>
-      </w:tr>
-      <w:tr>
-        <w:tc>
-          <w:tcPr/>
-          <w:p>
-            <w:pPr>
-              <w:pStyle w:val="Compact"/>
-            </w:pPr>
-            <w:r>
-              <w:t xml:space="preserve">32–37</w:t>
-            </w:r>
-          </w:p>
-        </w:tc>
-        <w:tc>
-          <w:tcPr/>
-          <w:p>
-            <w:pPr>
-              <w:pStyle w:val="Compact"/>
-            </w:pPr>
-            <w:r>
-              <w:t xml:space="preserve">Sense-making + Turn and Talk #2</w:t>
-            </w:r>
-          </w:p>
-        </w:tc>
-        <w:tc>
-          <w:tcPr/>
-          <w:p>
-            <w:pPr>
-              <w:pStyle w:val="Compact"/>
-            </w:pPr>
-            <w:r>
-              <w:t xml:space="preserve">Pair-share the resultant for a 3,4 vector; debrief Pythagorean reasoning</w:t>
-            </w:r>
-          </w:p>
-        </w:tc>
-      </w:tr>
-      <w:tr>
-        <w:tc>
-          <w:tcPr/>
-          <w:p>
-            <w:pPr>
-              <w:pStyle w:val="Compact"/>
-            </w:pPr>
-            <w:r>
-              <w:t xml:space="preserve">37–40</w:t>
-            </w:r>
-          </w:p>
-        </w:tc>
-        <w:tc>
-          <w:tcPr/>
-          <w:p>
-            <w:pPr>
-              <w:pStyle w:val="Compact"/>
-            </w:pPr>
-            <w:r>
-              <w:t xml:space="preserve">Vocabulary + Revise Model</w:t>
-            </w:r>
-          </w:p>
-        </w:tc>
-        <w:tc>
-          <w:tcPr/>
-          <w:p>
-            <w:pPr>
-              <w:pStyle w:val="Compact"/>
-            </w:pPr>
-            <w:r>
-              <w:t xml:space="preserve">Introduce</w:t>
-            </w:r>
-            <w:r>
-              <w:t xml:space="preserve"> </w:t>
-            </w:r>
-            <w:r>
-              <w:rPr>
-                <w:b/>
-                <w:bCs/>
-              </w:rPr>
-              <w:t xml:space="preserve">vector / magnitude / direction</w:t>
-            </w:r>
-            <w:r>
-              <w:t xml:space="preserve"> </w:t>
-            </w:r>
-            <w:r>
-              <w:t xml:space="preserve">in the second half; students update their initial sketch</w:t>
-            </w:r>
-          </w:p>
-        </w:tc>
-      </w:tr>
-      <w:tr>
-        <w:tc>
-          <w:tcPr/>
-          <w:p>
-            <w:pPr>
-              <w:pStyle w:val="Compact"/>
-            </w:pPr>
-            <w:r>
-              <w:t xml:space="preserve">40–42</w:t>
-            </w:r>
-          </w:p>
-        </w:tc>
-        <w:tc>
-          <w:tcPr/>
-          <w:p>
-            <w:pPr>
-              <w:pStyle w:val="Compact"/>
-            </w:pPr>
-            <w:r>
-              <w:t xml:space="preserve">Exit Ticket + Closing Reflection</w:t>
-            </w:r>
-          </w:p>
-        </w:tc>
-        <w:tc>
-          <w:tcPr/>
-          <w:p>
-            <w:pPr>
-              <w:pStyle w:val="Compact"/>
-            </w:pPr>
-            <w:r>
-              <w:t xml:space="preserve">Boat problem (5 km E + 12 km N); reflection prompt</w:t>
-            </w:r>
-          </w:p>
-        </w:tc>
-      </w:tr>
-    </w:tbl>
-    <w:bookmarkEnd w:id="25"/>
-    <w:bookmarkStart w:id="26" w:name="discussion-prompts"/>
-    <w:p>
-      <w:pPr>
-        <w:pStyle w:val="Heading2"/>
-      </w:pPr>
-      <w:r>
-        <w:t xml:space="preserve">Discussion Prompts</w:t>
-      </w:r>
-    </w:p>
-    <w:p>
-      <w:pPr>
-        <w:pStyle w:val="Compact"/>
-        <w:numPr>
-          <w:ilvl w:val="0"/>
-          <w:numId w:val="1004"/>
-        </w:numPr>
-      </w:pPr>
-      <w:r>
-        <w:t xml:space="preserve">“When two vectors point the same direction, what happens to their resultant? When they point in opposite directions? When they’re perpendicular?”</w:t>
-      </w:r>
-    </w:p>
-    <w:p>
-      <w:pPr>
-        <w:pStyle w:val="Compact"/>
-        <w:numPr>
-          <w:ilvl w:val="0"/>
-          <w:numId w:val="1004"/>
-        </w:numPr>
-      </w:pPr>
-      <w:r>
-        <w:rPr>
-          <w:i/>
-          <w:iCs/>
-        </w:rPr>
-        <w:t xml:space="preserve">Sample student response:</w:t>
-      </w:r>
-      <w:r>
-        <w:t xml:space="preserve"> </w:t>
-      </w:r>
-      <w:r>
-        <w:t xml:space="preserve">“When perpendicular, the resultant is the diagonal of a rectangle, so we use Pythagoras to get its size.”</w:t>
-      </w:r>
-    </w:p>
-    <w:p>
-      <w:pPr>
-        <w:pStyle w:val="Compact"/>
-        <w:numPr>
-          <w:ilvl w:val="0"/>
-          <w:numId w:val="1004"/>
-        </w:numPr>
-      </w:pPr>
-      <w:r>
-        <w:t xml:space="preserve">“Could two different pairs of vectors give the same resultant? How would you draw an example?”</w:t>
-      </w:r>
-    </w:p>
-    <w:p>
-      <w:pPr>
-        <w:pStyle w:val="Compact"/>
-        <w:numPr>
-          <w:ilvl w:val="0"/>
-          <w:numId w:val="1004"/>
-        </w:numPr>
-      </w:pPr>
-      <w:r>
-        <w:t xml:space="preserve">“If you swap A and B in head-to-tail addition, does the resultant change? Why or why not?”</w:t>
-      </w:r>
-    </w:p>
-    <w:bookmarkEnd w:id="26"/>
-    <w:bookmarkStart w:id="27" w:name="common-misconceptions"/>
-    <w:p>
-      <w:pPr>
-        <w:pStyle w:val="Heading2"/>
-      </w:pPr>
-      <w:r>
-        <w:t xml:space="preserve">Common Misconceptions</w:t>
-      </w:r>
-    </w:p>
-    <w:p>
-      <w:pPr>
-        <w:pStyle w:val="Compact"/>
-        <w:numPr>
-          <w:ilvl w:val="0"/>
-          <w:numId w:val="1005"/>
-        </w:numPr>
-      </w:pPr>
-      <w:r>
-        <w:rPr>
-          <w:b/>
-          <w:bCs/>
-        </w:rPr>
-        <w:t xml:space="preserve">Misconception:</w:t>
-      </w:r>
-      <w:r>
-        <w:t xml:space="preserve"> </w:t>
-      </w:r>
-      <w:r>
-        <w:t xml:space="preserve">“Vectors with bigger numbers are always longer.”</w:t>
-      </w:r>
-      <w:r>
-        <w:t xml:space="preserve"> </w:t>
-      </w:r>
-      <w:r>
-        <w:t xml:space="preserve">→</w:t>
-      </w:r>
-      <w:r>
-        <w:t xml:space="preserve"> </w:t>
-      </w:r>
-      <w:r>
-        <w:rPr>
-          <w:b/>
-          <w:bCs/>
-        </w:rPr>
-        <w:t xml:space="preserve">Correction:</w:t>
-      </w:r>
-      <w:r>
-        <w:t xml:space="preserve"> </w:t>
-      </w:r>
-      <w:r>
-        <w:t xml:space="preserve">Two vectors of equal magnitude but different directions add to</w:t>
-      </w:r>
-      <w:r>
-        <w:t xml:space="preserve"> </w:t>
-      </w:r>
-      <w:r>
-        <w:rPr>
-          <w:i/>
-          <w:iCs/>
-        </w:rPr>
-        <w:t xml:space="preserve">different</w:t>
-      </w:r>
-      <w:r>
-        <w:t xml:space="preserve"> </w:t>
-      </w:r>
-      <w:r>
-        <w:t xml:space="preserve">resultants — direction matters as much as magnitude.</w:t>
-      </w:r>
-    </w:p>
-    <w:p>
-      <w:pPr>
-        <w:pStyle w:val="Compact"/>
-        <w:numPr>
-          <w:ilvl w:val="0"/>
-          <w:numId w:val="1005"/>
-        </w:numPr>
-      </w:pPr>
-      <w:r>
-        <w:rPr>
-          <w:b/>
-          <w:bCs/>
-        </w:rPr>
-        <w:t xml:space="preserve">Misconception:</w:t>
-      </w:r>
-      <w:r>
-        <w:t xml:space="preserve"> </w:t>
-      </w:r>
-      <w:r>
-        <w:t xml:space="preserve">“Adding vectors is the same as adding their magnitudes.”</w:t>
-      </w:r>
-      <w:r>
-        <w:t xml:space="preserve"> </w:t>
-      </w:r>
-      <w:r>
-        <w:t xml:space="preserve">→</w:t>
-      </w:r>
-      <w:r>
-        <w:t xml:space="preserve"> </w:t>
-      </w:r>
-      <w:r>
-        <w:rPr>
-          <w:b/>
-          <w:bCs/>
-        </w:rPr>
-        <w:t xml:space="preserve">Correction:</w:t>
-      </w:r>
-      <w:r>
-        <w:t xml:space="preserve"> </w:t>
-      </w:r>
-      <w:r>
-        <w:t xml:space="preserve">That is only true when they point in exactly the same direction. In every other case the resultant magnitude is</w:t>
-      </w:r>
-      <w:r>
-        <w:t xml:space="preserve"> </w:t>
-      </w:r>
-      <w:r>
-        <w:rPr>
-          <w:i/>
-          <w:iCs/>
-        </w:rPr>
-        <w:t xml:space="preserve">less</w:t>
-      </w:r>
-      <w:r>
-        <w:t xml:space="preserve"> </w:t>
-      </w:r>
-      <w:r>
-        <w:t xml:space="preserve">than the sum (and equals zero when they cancel).</w:t>
-      </w:r>
-    </w:p>
-    <w:p>
-      <w:pPr>
-        <w:pStyle w:val="Compact"/>
-        <w:numPr>
-          <w:ilvl w:val="0"/>
-          <w:numId w:val="1005"/>
-        </w:numPr>
-      </w:pPr>
-      <w:r>
-        <w:rPr>
-          <w:b/>
-          <w:bCs/>
-        </w:rPr>
-        <w:t xml:space="preserve">Misconception:</w:t>
-      </w:r>
-      <w:r>
-        <w:t xml:space="preserve"> </w:t>
-      </w:r>
-      <w:r>
-        <w:t xml:space="preserve">“The resultant is always longer than each input vector.”</w:t>
-      </w:r>
-      <w:r>
-        <w:t xml:space="preserve"> </w:t>
-      </w:r>
-      <w:r>
-        <w:t xml:space="preserve">→</w:t>
-      </w:r>
-      <w:r>
-        <w:t xml:space="preserve"> </w:t>
-      </w:r>
-      <w:r>
-        <w:rPr>
-          <w:b/>
-          <w:bCs/>
-        </w:rPr>
-        <w:t xml:space="preserve">Correction:</w:t>
-      </w:r>
-      <w:r>
-        <w:t xml:space="preserve"> </w:t>
-      </w:r>
-      <w:r>
-        <w:t xml:space="preserve">Not when the vectors point opposite directions. The resultant can be shorter than either input, or even zero.</w:t>
-      </w:r>
-    </w:p>
-    <w:bookmarkEnd w:id="27"/>
-    <w:bookmarkStart w:id="28" w:name="access-differentiation"/>
-    <w:p>
-      <w:pPr>
-        <w:pStyle w:val="Heading2"/>
-      </w:pPr>
-      <w:r>
-        <w:t xml:space="preserve">Access &amp; Differentiation</w:t>
-      </w:r>
-    </w:p>
-    <w:p>
-      <w:pPr>
-        <w:pStyle w:val="Compact"/>
-        <w:numPr>
-          <w:ilvl w:val="0"/>
-          <w:numId w:val="1006"/>
-        </w:numPr>
-      </w:pPr>
-      <w:r>
-        <w:rPr>
-          <w:b/>
-          <w:bCs/>
-        </w:rPr>
-        <w:t xml:space="preserve">ELL/ENL supports:</w:t>
-      </w:r>
-      <w:r>
-        <w:t xml:space="preserve"> </w:t>
-      </w:r>
-      <w:r>
-        <w:t xml:space="preserve">Sentence frames — *“The resultant of A + B has magnitude ___ because ___.”* and *“Adding A and B gives a resultant that points ___.”* Word-choice box: {magnitude, direction, resultant, components, scalar}. Visual-first framing — show two arrows on a grid before introducing the word</w:t>
-      </w:r>
-      <w:r>
-        <w:t xml:space="preserve"> </w:t>
-      </w:r>
-      <w:r>
-        <w:rPr>
-          <w:i/>
-          <w:iCs/>
-        </w:rPr>
-        <w:t xml:space="preserve">vector</w:t>
-      </w:r>
-      <w:r>
-        <w:t xml:space="preserve">. Bilingual glossary slot in student notebook for the three vocabulary words.</w:t>
-      </w:r>
-    </w:p>
-    <w:p>
-      <w:pPr>
-        <w:pStyle w:val="Compact"/>
-        <w:numPr>
-          <w:ilvl w:val="0"/>
-          <w:numId w:val="1006"/>
-        </w:numPr>
-      </w:pPr>
-      <w:r>
-        <w:rPr>
-          <w:b/>
-          <w:bCs/>
-        </w:rPr>
-        <w:t xml:space="preserve">IEP/SPED supports:</w:t>
-      </w:r>
-      <w:r>
-        <w:t xml:space="preserve"> </w:t>
-      </w:r>
-      <w:r>
-        <w:t xml:space="preserve">Use the printed Vector Golf course as a chunked, scaffolded organizer; pre-draw the first arrow for each problem so students start from the head of an existing arrow. Provide a step list: (1) draw A from origin, (2) draw B from head of A, (3) draw R from origin to head of B. Allow oral responses for the exit ticket.</w:t>
-      </w:r>
-    </w:p>
-    <w:p>
-      <w:pPr>
-        <w:pStyle w:val="Compact"/>
-        <w:numPr>
-          <w:ilvl w:val="0"/>
-          <w:numId w:val="1006"/>
-        </w:numPr>
-      </w:pPr>
-      <w:r>
-        <w:rPr>
-          <w:b/>
-          <w:bCs/>
-        </w:rPr>
-        <w:t xml:space="preserve">Extensions:</w:t>
-      </w:r>
-      <w:r>
-        <w:t xml:space="preserve"> </w:t>
-      </w:r>
-      <w:r>
-        <w:t xml:space="preserve">After Vector Golf, prompt advanced students to find the</w:t>
-      </w:r>
-      <w:r>
-        <w:t xml:space="preserve"> </w:t>
-      </w:r>
-      <w:r>
-        <w:rPr>
-          <w:i/>
-          <w:iCs/>
-        </w:rPr>
-        <w:t xml:space="preserve">minimum</w:t>
-      </w:r>
-      <w:r>
-        <w:t xml:space="preserve"> </w:t>
-      </w:r>
-      <w:r>
-        <w:t xml:space="preserve">number of vector additions to reach the target — introduces optimization thinking and previews path-planning intuition. Or: ask them to invent a 3-vector course where the resultant is exactly zero.</w:t>
-      </w:r>
-    </w:p>
-    <w:bookmarkEnd w:id="28"/>
-    <w:bookmarkStart w:id="29" w:name="strategy-spotlight"/>
-    <w:p>
-      <w:pPr>
-        <w:pStyle w:val="Heading2"/>
-      </w:pPr>
-      <w:r>
-        <w:t xml:space="preserve">Strategy Spotlight</w:t>
-      </w:r>
-    </w:p>
-    <w:p>
-      <w:pPr>
-        <w:pStyle w:val="FirstParagraph"/>
-      </w:pPr>
-      <w:r>
-        <w:rPr>
-          <w:b/>
-          <w:bCs/>
-        </w:rPr>
-        <w:t xml:space="preserve">Restorative Circle (unit opener, 2 min)</w:t>
-      </w:r>
-      <w:r>
-        <w:t xml:space="preserve"> </w:t>
-      </w:r>
-      <w:r>
-        <w:t xml:space="preserve">— As students arrive, arrange chairs in a circle (or have students stand in a circle if the room is tight). Pass a small object hand-to-hand. Each student answers a single prompt:</w:t>
-      </w:r>
-      <w:r>
-        <w:t xml:space="preserve"> </w:t>
-      </w:r>
-      <w:r>
-        <w:rPr>
-          <w:i/>
-          <w:iCs/>
-        </w:rPr>
-        <w:t xml:space="preserve">“What is one experience you’ve had with motion this week?”</w:t>
-      </w:r>
-      <w:r>
-        <w:t xml:space="preserve"> </w:t>
-      </w:r>
-      <w:r>
-        <w:t xml:space="preserve">Pass-rights are honored — students may say</w:t>
-      </w:r>
-      <w:r>
-        <w:t xml:space="preserve"> </w:t>
-      </w:r>
-      <w:r>
-        <w:t xml:space="preserve">“pass”</w:t>
-      </w:r>
-      <w:r>
-        <w:t xml:space="preserve"> </w:t>
-      </w:r>
-      <w:r>
-        <w:t xml:space="preserve">without explanation. Do not respond to or evaluate any answer; nod, pass to the next student. The goal is community-building before the unit’s content load begins. Close the circle by inviting one volunteer to reflect:</w:t>
-      </w:r>
-      <w:r>
-        <w:t xml:space="preserve"> </w:t>
-      </w:r>
-      <w:r>
-        <w:t xml:space="preserve">“What’s something you noticed about what people shared?”</w:t>
-      </w:r>
-    </w:p>
-    <w:p>
-      <w:pPr>
-        <w:pStyle w:val="BodyText"/>
-      </w:pPr>
-      <w:r>
-        <w:rPr>
-          <w:b/>
-          <w:bCs/>
-        </w:rPr>
-        <w:t xml:space="preserve">Active Learning — Vector Golf stations (15 min)</w:t>
-      </w:r>
-      <w:r>
-        <w:t xml:space="preserve"> </w:t>
-      </w:r>
-      <w:r>
-        <w:t xml:space="preserve">— Set up four stations around the room, each with a different</w:t>
-      </w:r>
-      <w:r>
-        <w:t xml:space="preserve"> </w:t>
-      </w:r>
-      <w:r>
-        <w:t xml:space="preserve">“course”</w:t>
-      </w:r>
-      <w:r>
-        <w:t xml:space="preserve"> </w:t>
-      </w:r>
-      <w:r>
-        <w:t xml:space="preserve">(a starting point and a target on a coordinate grid). Each station has chart paper at standing height (vertical non-permanent surface lite). Form random groups of 3 (use a deck of cards: same-suit groups). Three-minute rotations. At each station, the group must use head-to-tail vector addition to plot a sequence of arrows that lands on the target. They leave their solution on the chart paper for the next group to verify. Walk the room and ask the discussion prompts above; resist solving — let groups argue.</w:t>
-      </w:r>
-    </w:p>
-    <w:bookmarkEnd w:id="29"/>
-    <w:bookmarkStart w:id="30" w:name="exit-ticket-closing-reflection"/>
-    <w:p>
-      <w:pPr>
-        <w:pStyle w:val="Heading2"/>
-      </w:pPr>
-      <w:r>
-        <w:t xml:space="preserve">Exit Ticket + Closing Reflection</w:t>
-      </w:r>
-    </w:p>
-    <w:p>
-      <w:pPr>
-        <w:pStyle w:val="FirstParagraph"/>
-      </w:pPr>
-      <w:r>
-        <w:t xml:space="preserve">A boat sails 5 km east, then 12 km north. Sketch the resultant displacement on a grid. Find its magnitude. Show one sentence of reasoning.</w:t>
-      </w:r>
-    </w:p>
-    <w:p>
-      <w:pPr>
-        <w:pStyle w:val="BodyText"/>
-      </w:pPr>
-      <w:r>
-        <w:rPr>
-          <w:i/>
-          <w:iCs/>
-        </w:rPr>
-        <w:t xml:space="preserve">Closing reflection (30 sec, on the same exit slip):</w:t>
-      </w:r>
-      <w:r>
-        <w:t xml:space="preserve"> </w:t>
-      </w:r>
-      <w:r>
-        <w:t xml:space="preserve">What is one thing that surprised you today? Who helped you make sense of something?</w:t>
-      </w:r>
-    </w:p>
-    <w:bookmarkEnd w:id="30"/>
-    <w:bookmarkStart w:id="31" w:name="companion-materials"/>
-    <w:p>
-      <w:pPr>
-        <w:pStyle w:val="Heading2"/>
-      </w:pPr>
-      <w:r>
-        <w:t xml:space="preserve">Companion Materials</w:t>
-      </w:r>
-    </w:p>
-    <w:p>
-      <w:pPr>
-        <w:pStyle w:val="Compact"/>
-        <w:numPr>
-          <w:ilvl w:val="0"/>
-          <w:numId w:val="1007"/>
-        </w:numPr>
-      </w:pPr>
-      <w:r>
-        <w:rPr>
-          <w:rStyle w:val="VerbatimChar"/>
-        </w:rPr>
-        <w:t xml:space="preserve">Student_Exploration.html</w:t>
-      </w:r>
-      <w:r>
-        <w:t xml:space="preserve"> </w:t>
-      </w:r>
-      <w:r>
-        <w:t xml:space="preserve">(rich interactive)</w:t>
-      </w:r>
-    </w:p>
-    <w:p>
-      <w:pPr>
-        <w:pStyle w:val="Compact"/>
-        <w:numPr>
-          <w:ilvl w:val="0"/>
-          <w:numId w:val="1007"/>
-        </w:numPr>
-      </w:pPr>
-      <w:r>
-        <w:rPr>
-          <w:rStyle w:val="VerbatimChar"/>
-        </w:rPr>
-        <w:t xml:space="preserve">Student_Exploration.onenote.html</w:t>
-      </w:r>
-      <w:r>
-        <w:t xml:space="preserve"> </w:t>
-      </w:r>
-      <w:r>
-        <w:t xml:space="preserve">(OneNote-paste static)</w:t>
-      </w:r>
-    </w:p>
-    <w:p>
-      <w:pPr>
-        <w:pStyle w:val="Compact"/>
-        <w:numPr>
-          <w:ilvl w:val="0"/>
-          <w:numId w:val="1007"/>
-        </w:numPr>
-      </w:pPr>
-      <w:r>
-        <w:rPr>
-          <w:rStyle w:val="VerbatimChar"/>
-        </w:rPr>
-        <w:t xml:space="preserve">Answer_Key.docx</w:t>
-      </w:r>
-    </w:p>
-    <w:bookmarkEnd w:id="31"/>
-    <w:bookmarkStart w:id="32" w:name="key-vocabulary-max-3"/>
-    <w:p>
-      <w:pPr>
-        <w:pStyle w:val="Heading2"/>
-      </w:pPr>
-      <w:r>
-        <w:t xml:space="preserve">Key Vocabulary (max 3)</w:t>
-      </w:r>
-    </w:p>
-    <w:p>
-      <w:pPr>
-        <w:pStyle w:val="Compact"/>
-        <w:numPr>
-          <w:ilvl w:val="0"/>
-          <w:numId w:val="1008"/>
-        </w:numPr>
-      </w:pPr>
-      <w:r>
-        <w:rPr>
-          <w:b/>
-          <w:bCs/>
-        </w:rPr>
-        <w:t xml:space="preserve">vector</w:t>
-      </w:r>
-      <w:r>
-        <w:t xml:space="preserve"> </w:t>
-      </w:r>
-      <w:r>
-        <w:t xml:space="preserve">— a quantity with both magnitude and direction</w:t>
-      </w:r>
-    </w:p>
-    <w:p>
-      <w:pPr>
-        <w:pStyle w:val="Compact"/>
-        <w:numPr>
-          <w:ilvl w:val="0"/>
-          <w:numId w:val="1008"/>
-        </w:numPr>
-      </w:pPr>
-      <w:r>
-        <w:rPr>
-          <w:b/>
-          <w:bCs/>
-        </w:rPr>
-        <w:t xml:space="preserve">magnitude</w:t>
-      </w:r>
-      <w:r>
-        <w:t xml:space="preserve"> </w:t>
-      </w:r>
-      <w:r>
-        <w:t xml:space="preserve">— the size or length of a vector</w:t>
-      </w:r>
-    </w:p>
-    <w:p>
-      <w:pPr>
-        <w:pStyle w:val="Compact"/>
-        <w:numPr>
-          <w:ilvl w:val="0"/>
-          <w:numId w:val="1008"/>
-        </w:numPr>
-      </w:pPr>
-      <w:r>
-        <w:rPr>
-          <w:b/>
-          <w:bCs/>
-        </w:rPr>
-        <w:t xml:space="preserve">direction</w:t>
-      </w:r>
-      <w:r>
-        <w:t xml:space="preserve"> </w:t>
-      </w:r>
-      <w:r>
-        <w:t xml:space="preserve">— the way a vector points, often given as an angle</w:t>
-      </w:r>
-    </w:p>
-    <w:bookmarkEnd w:id="32"/>
-    <w:bookmarkEnd w:id="33"/>
+    <w:bookmarkEnd w:id="44"/>
+    <w:bookmarkEnd w:id="45"/>
     <w:sectPr>
       <w:pgSz w:h="15840" w:w="12240"/>
       <w:pgMar w:bottom="1152" w:footer="720" w:gutter="0" w:header="720" w:left="1296" w:right="1296" w:top="1152"/>
@@ -2392,6 +3782,24 @@
     <w:abstractNumId w:val="991"/>
   </w:num>
   <w:num w:numId="1008">
+    <w:abstractNumId w:val="991"/>
+  </w:num>
+  <w:num w:numId="1009">
+    <w:abstractNumId w:val="991"/>
+  </w:num>
+  <w:num w:numId="1010">
+    <w:abstractNumId w:val="991"/>
+  </w:num>
+  <w:num w:numId="1011">
+    <w:abstractNumId w:val="991"/>
+  </w:num>
+  <w:num w:numId="1012">
+    <w:abstractNumId w:val="991"/>
+  </w:num>
+  <w:num w:numId="1013">
+    <w:abstractNumId w:val="991"/>
+  </w:num>
+  <w:num w:numId="1014">
     <w:abstractNumId w:val="991"/>
   </w:num>
 </w:numbering>

</xml_diff>